<commit_message>
creacion del archivo html e insercion de datos y creacion de vistas en base de datos
</commit_message>
<xml_diff>
--- a/proyecto_informe.docx
+++ b/proyecto_informe.docx
@@ -30,6 +30,16 @@
     </w:p>
     <w:p>
       <w:r>
+        <w:t>Día 23-3:</w:t>
+      </w:r>
+    </w:p>
+    <w:p>
+      <w:r>
+        <w:t>Investigación para el diseño.</w:t>
+      </w:r>
+    </w:p>
+    <w:p>
+      <w:r>
         <w:t>P</w:t>
       </w:r>
       <w:r>
@@ -71,19 +81,7 @@
           <w:rPr>
             <w:rStyle w:val="Hipervnculo"/>
           </w:rPr>
-          <w:t>https://agen</w:t>
-        </w:r>
-        <w:r>
-          <w:rPr>
-            <w:rStyle w:val="Hipervnculo"/>
-          </w:rPr>
-          <w:t>d</w:t>
-        </w:r>
-        <w:r>
-          <w:rPr>
-            <w:rStyle w:val="Hipervnculo"/>
-          </w:rPr>
-          <w:t>agijon.com/</w:t>
+          <w:t>https://agendagijon.com/</w:t>
         </w:r>
       </w:hyperlink>
       <w:r>
@@ -141,11 +139,9 @@
       <w:r>
         <w:t xml:space="preserve">Me gusta la disposición de la información mejor ordenada y de forma </w:t>
       </w:r>
-      <w:proofErr w:type="spellStart"/>
-      <w:r>
-        <w:t>mas</w:t>
-      </w:r>
-      <w:proofErr w:type="spellEnd"/>
+      <w:r>
+        <w:t>más</w:t>
+      </w:r>
       <w:r>
         <w:t xml:space="preserve"> visual además de contar con un buscador al entrar a la web</w:t>
       </w:r>
@@ -213,7 +209,37 @@
         <w:t>-</w:t>
       </w:r>
       <w:r>
-        <w:t xml:space="preserve">Esquema: </w:t>
+        <w:t>Esquema</w:t>
+      </w:r>
+      <w:r>
+        <w:t xml:space="preserve"> de </w:t>
+      </w:r>
+      <w:proofErr w:type="spellStart"/>
+      <w:r>
+        <w:t>como</w:t>
+      </w:r>
+      <w:proofErr w:type="spellEnd"/>
+      <w:r>
+        <w:t xml:space="preserve"> se va a ver la </w:t>
+      </w:r>
+      <w:proofErr w:type="spellStart"/>
+      <w:r>
+        <w:t>pagina</w:t>
+      </w:r>
+      <w:proofErr w:type="spellEnd"/>
+      <w:r>
+        <w:t>(</w:t>
+      </w:r>
+      <w:proofErr w:type="spellStart"/>
+      <w:r>
+        <w:t>wireframe</w:t>
+      </w:r>
+      <w:proofErr w:type="spellEnd"/>
+      <w:r>
+        <w:t>)</w:t>
+      </w:r>
+      <w:r>
+        <w:t xml:space="preserve">: </w:t>
       </w:r>
       <w:r>
         <w:t xml:space="preserve"> </w:t>
@@ -223,19 +249,7 @@
           <w:rPr>
             <w:rStyle w:val="Hipervnculo"/>
           </w:rPr>
-          <w:t>https://www.figma.com/pro</w:t>
-        </w:r>
-        <w:r>
-          <w:rPr>
-            <w:rStyle w:val="Hipervnculo"/>
-          </w:rPr>
-          <w:t>t</w:t>
-        </w:r>
-        <w:r>
-          <w:rPr>
-            <w:rStyle w:val="Hipervnculo"/>
-          </w:rPr>
-          <w:t>o/B98AxKuOVJ03kcHg7aNVUm/wireframe?node-id=0-1&amp;t=dw43iwZ1loDRSwek-1</w:t>
+          <w:t>https://www.figma.com/proto/B98AxKuOVJ03kcHg7aNVUm/wireframe?node-id=0-1&amp;t=dw43iwZ1loDRSwek-1</w:t>
         </w:r>
       </w:hyperlink>
       <w:r>
@@ -244,7 +258,131 @@
     </w:p>
     <w:p>
       <w:r>
+        <w:t>Dia 24-3:</w:t>
+      </w:r>
+    </w:p>
+    <w:p>
+      <w:r>
+        <w:t>Creación de las clases en java y el menú.</w:t>
+      </w:r>
+    </w:p>
+    <w:p>
+      <w:r>
+        <w:t xml:space="preserve">Investigar </w:t>
+      </w:r>
+      <w:proofErr w:type="spellStart"/>
+      <w:r>
+        <w:t>hashmap</w:t>
+      </w:r>
+      <w:proofErr w:type="spellEnd"/>
+    </w:p>
+    <w:p>
+      <w:r>
+        <w:t xml:space="preserve">Esquema de la base de datos en </w:t>
+      </w:r>
+      <w:proofErr w:type="spellStart"/>
+      <w:r>
+        <w:t>dia</w:t>
+      </w:r>
+      <w:proofErr w:type="spellEnd"/>
+      <w:r>
+        <w:t>.</w:t>
+      </w:r>
+    </w:p>
+    <w:p/>
+    <w:p/>
+    <w:p>
+      <w:r>
         <w:lastRenderedPageBreak/>
+        <w:drawing>
+          <wp:inline distT="0" distB="0" distL="0" distR="0" wp14:anchorId="57A1F5D5" wp14:editId="4FF77F2F">
+            <wp:extent cx="5400040" cy="2711450"/>
+            <wp:effectExtent l="0" t="0" r="0" b="0"/>
+            <wp:docPr id="1244900038" name="Imagen 1"/>
+            <wp:cNvGraphicFramePr>
+              <a:graphicFrameLocks xmlns:a="http://schemas.openxmlformats.org/drawingml/2006/main" noChangeAspect="1"/>
+            </wp:cNvGraphicFramePr>
+            <a:graphic xmlns:a="http://schemas.openxmlformats.org/drawingml/2006/main">
+              <a:graphicData uri="http://schemas.openxmlformats.org/drawingml/2006/picture">
+                <pic:pic xmlns:pic="http://schemas.openxmlformats.org/drawingml/2006/picture">
+                  <pic:nvPicPr>
+                    <pic:cNvPr id="1244900038" name=""/>
+                    <pic:cNvPicPr/>
+                  </pic:nvPicPr>
+                  <pic:blipFill>
+                    <a:blip r:embed="rId11"/>
+                    <a:stretch>
+                      <a:fillRect/>
+                    </a:stretch>
+                  </pic:blipFill>
+                  <pic:spPr>
+                    <a:xfrm>
+                      <a:off x="0" y="0"/>
+                      <a:ext cx="5400040" cy="2711450"/>
+                    </a:xfrm>
+                    <a:prstGeom prst="rect">
+                      <a:avLst/>
+                    </a:prstGeom>
+                  </pic:spPr>
+                </pic:pic>
+              </a:graphicData>
+            </a:graphic>
+          </wp:inline>
+        </w:drawing>
+      </w:r>
+    </w:p>
+    <w:p>
+      <w:r>
+        <w:t xml:space="preserve">Creación de </w:t>
+      </w:r>
+      <w:proofErr w:type="gramStart"/>
+      <w:r>
+        <w:t>las tabla</w:t>
+      </w:r>
+      <w:proofErr w:type="gramEnd"/>
+      <w:r>
+        <w:t xml:space="preserve"> en base de datos</w:t>
+      </w:r>
+      <w:r>
+        <w:t xml:space="preserve"> y empiezan las vistas</w:t>
+      </w:r>
+    </w:p>
+    <w:p/>
+    <w:p>
+      <w:r>
+        <w:t xml:space="preserve">**hay que cambiar las fotos de </w:t>
+      </w:r>
+      <w:proofErr w:type="spellStart"/>
+      <w:r>
+        <w:t>jpeg</w:t>
+      </w:r>
+      <w:proofErr w:type="spellEnd"/>
+      <w:r>
+        <w:t xml:space="preserve"> a web todas </w:t>
+      </w:r>
+      <w:proofErr w:type="spellStart"/>
+      <w:r>
+        <w:t>por que</w:t>
+      </w:r>
+      <w:proofErr w:type="spellEnd"/>
+      <w:r>
+        <w:t xml:space="preserve"> es mucho </w:t>
+      </w:r>
+      <w:proofErr w:type="spellStart"/>
+      <w:r>
+        <w:t>mas</w:t>
+      </w:r>
+      <w:proofErr w:type="spellEnd"/>
+      <w:r>
+        <w:t xml:space="preserve"> eficiente</w:t>
+      </w:r>
+    </w:p>
+    <w:p/>
+    <w:p>
+      <w:r>
+        <w:rPr>
+          <w:noProof/>
+        </w:rPr>
         <w:drawing>
           <wp:inline distT="0" distB="0" distL="0" distR="0" wp14:anchorId="0821D05B" wp14:editId="19B3B606">
             <wp:extent cx="3880819" cy="4183380"/>
@@ -261,7 +399,7 @@
                     <pic:cNvPicPr/>
                   </pic:nvPicPr>
                   <pic:blipFill>
-                    <a:blip r:embed="rId11"/>
+                    <a:blip r:embed="rId12"/>
                     <a:stretch>
                       <a:fillRect/>
                     </a:stretch>
@@ -284,6 +422,10 @@
     </w:p>
     <w:p>
       <w:r>
+        <w:rPr>
+          <w:noProof/>
+        </w:rPr>
+        <w:lastRenderedPageBreak/>
         <w:drawing>
           <wp:inline distT="0" distB="0" distL="0" distR="0" wp14:anchorId="76D7D508" wp14:editId="07858B06">
             <wp:extent cx="3909060" cy="4379764"/>
@@ -300,7 +442,7 @@
                     <pic:cNvPicPr/>
                   </pic:nvPicPr>
                   <pic:blipFill>
-                    <a:blip r:embed="rId12"/>
+                    <a:blip r:embed="rId13"/>
                     <a:stretch>
                       <a:fillRect/>
                     </a:stretch>
@@ -323,7 +465,9 @@
     </w:p>
     <w:p>
       <w:r>
-        <w:lastRenderedPageBreak/>
+        <w:rPr>
+          <w:noProof/>
+        </w:rPr>
         <w:drawing>
           <wp:inline distT="0" distB="0" distL="0" distR="0" wp14:anchorId="6156E383" wp14:editId="5EAB0A8A">
             <wp:extent cx="3804284" cy="4163060"/>
@@ -340,7 +484,7 @@
                     <pic:cNvPicPr/>
                   </pic:nvPicPr>
                   <pic:blipFill>
-                    <a:blip r:embed="rId13"/>
+                    <a:blip r:embed="rId14"/>
                     <a:stretch>
                       <a:fillRect/>
                     </a:stretch>
@@ -359,6 +503,12 @@
             </a:graphic>
           </wp:inline>
         </w:drawing>
+      </w:r>
+    </w:p>
+    <w:p>
+      <w:r>
+        <w:lastRenderedPageBreak/>
+        <w:t>Día 25-3:</w:t>
       </w:r>
     </w:p>
     <w:p/>

</xml_diff>

<commit_message>
Insercion de datos y arrglo de errores en base de datos + creacion de metodos en proyecto java
</commit_message>
<xml_diff>
--- a/proyecto_informe.docx
+++ b/proyecto_informe.docx
@@ -293,6 +293,9 @@
     <w:p/>
     <w:p>
       <w:r>
+        <w:rPr>
+          <w:noProof/>
+        </w:rPr>
         <w:lastRenderedPageBreak/>
         <w:drawing>
           <wp:inline distT="0" distB="0" distL="0" distR="0" wp14:anchorId="57A1F5D5" wp14:editId="4FF77F2F">
@@ -509,6 +512,67 @@
       <w:r>
         <w:lastRenderedPageBreak/>
         <w:t>Día 25-3:</w:t>
+      </w:r>
+    </w:p>
+    <w:p>
+      <w:r>
+        <w:t xml:space="preserve">Se empieza con el </w:t>
+      </w:r>
+      <w:proofErr w:type="spellStart"/>
+      <w:r>
+        <w:t>html</w:t>
+      </w:r>
+      <w:proofErr w:type="spellEnd"/>
+      <w:r>
+        <w:t xml:space="preserve"> y creación de vistas </w:t>
+      </w:r>
+      <w:proofErr w:type="spellStart"/>
+      <w:r>
+        <w:t>mas</w:t>
+      </w:r>
+      <w:proofErr w:type="spellEnd"/>
+      <w:r>
+        <w:t xml:space="preserve"> inserción de datos</w:t>
+      </w:r>
+    </w:p>
+    <w:p>
+      <w:r>
+        <w:t>Día 26-3:</w:t>
+      </w:r>
+    </w:p>
+    <w:p>
+      <w:r>
+        <w:t>Se continua con la inserción de datos, solucionar algunos fallos en la base de datos y arreglar las vistas</w:t>
+      </w:r>
+      <w:r>
+        <w:t xml:space="preserve">, funciona todo excepto por que con el </w:t>
+      </w:r>
+      <w:proofErr w:type="spellStart"/>
+      <w:r>
+        <w:t>user</w:t>
+      </w:r>
+      <w:proofErr w:type="spellEnd"/>
+      <w:r>
+        <w:t xml:space="preserve"> proyecto no deja tiene que ser con el </w:t>
+      </w:r>
+      <w:proofErr w:type="spellStart"/>
+      <w:r>
+        <w:t>admin</w:t>
+      </w:r>
+      <w:proofErr w:type="spellEnd"/>
+      <w:r>
+        <w:t>,</w:t>
+      </w:r>
+    </w:p>
+    <w:p>
+      <w:r>
+        <w:t>Se mejora el diseño en figma</w:t>
+      </w:r>
+      <w:r>
+        <w:br/>
+      </w:r>
+      <w:r>
+        <w:t>creación de dos métodos en proyecto java</w:t>
       </w:r>
     </w:p>
     <w:p/>

</xml_diff>

<commit_message>
Creacion de 5 metodos en java con fallos por arreglar
</commit_message>
<xml_diff>
--- a/proyecto_informe.docx
+++ b/proyecto_informe.docx
@@ -575,6 +575,26 @@
         <w:t>creación de dos métodos en proyecto java</w:t>
       </w:r>
     </w:p>
+    <w:p/>
+    <w:p>
+      <w:r>
+        <w:t>Dia 27-3:</w:t>
+      </w:r>
+    </w:p>
+    <w:p>
+      <w:r>
+        <w:t xml:space="preserve">Crear </w:t>
+      </w:r>
+      <w:proofErr w:type="spellStart"/>
+      <w:r>
+        <w:t>mas</w:t>
+      </w:r>
+      <w:proofErr w:type="spellEnd"/>
+      <w:r>
+        <w:t xml:space="preserve"> métodos de java</w:t>
+      </w:r>
+    </w:p>
+    <w:p/>
     <w:p/>
     <w:p/>
     <w:sectPr>

</xml_diff>

<commit_message>
Arreglo de errores y algunos metodos que no funcionan
</commit_message>
<xml_diff>
--- a/proyecto_informe.docx
+++ b/proyecto_informe.docx
@@ -206,6 +206,140 @@
     </w:p>
     <w:p>
       <w:r>
+        <w:rPr>
+          <w:noProof/>
+        </w:rPr>
+        <w:lastRenderedPageBreak/>
+        <w:drawing>
+          <wp:inline distT="0" distB="0" distL="0" distR="0" wp14:anchorId="5AAEDB86" wp14:editId="01288B3C">
+            <wp:extent cx="3880819" cy="4183380"/>
+            <wp:effectExtent l="0" t="0" r="5715" b="7620"/>
+            <wp:docPr id="1950235941" name="Imagen 1" descr="Diagrama&#10;&#10;El contenido generado por IA puede ser incorrecto."/>
+            <wp:cNvGraphicFramePr>
+              <a:graphicFrameLocks xmlns:a="http://schemas.openxmlformats.org/drawingml/2006/main" noChangeAspect="1"/>
+            </wp:cNvGraphicFramePr>
+            <a:graphic xmlns:a="http://schemas.openxmlformats.org/drawingml/2006/main">
+              <a:graphicData uri="http://schemas.openxmlformats.org/drawingml/2006/picture">
+                <pic:pic xmlns:pic="http://schemas.openxmlformats.org/drawingml/2006/picture">
+                  <pic:nvPicPr>
+                    <pic:cNvPr id="1950235941" name="Imagen 1" descr="Diagrama&#10;&#10;El contenido generado por IA puede ser incorrecto."/>
+                    <pic:cNvPicPr/>
+                  </pic:nvPicPr>
+                  <pic:blipFill>
+                    <a:blip r:embed="rId10"/>
+                    <a:stretch>
+                      <a:fillRect/>
+                    </a:stretch>
+                  </pic:blipFill>
+                  <pic:spPr>
+                    <a:xfrm>
+                      <a:off x="0" y="0"/>
+                      <a:ext cx="3889747" cy="4193004"/>
+                    </a:xfrm>
+                    <a:prstGeom prst="rect">
+                      <a:avLst/>
+                    </a:prstGeom>
+                  </pic:spPr>
+                </pic:pic>
+              </a:graphicData>
+            </a:graphic>
+          </wp:inline>
+        </w:drawing>
+      </w:r>
+    </w:p>
+    <w:p>
+      <w:r>
+        <w:rPr>
+          <w:noProof/>
+        </w:rPr>
+        <w:drawing>
+          <wp:inline distT="0" distB="0" distL="0" distR="0" wp14:anchorId="0B723153" wp14:editId="36DAFD4B">
+            <wp:extent cx="3909060" cy="4379764"/>
+            <wp:effectExtent l="0" t="0" r="0" b="1905"/>
+            <wp:docPr id="142612324" name="Imagen 1" descr="Imagen que contiene Aplicación&#10;&#10;El contenido generado por IA puede ser incorrecto."/>
+            <wp:cNvGraphicFramePr>
+              <a:graphicFrameLocks xmlns:a="http://schemas.openxmlformats.org/drawingml/2006/main" noChangeAspect="1"/>
+            </wp:cNvGraphicFramePr>
+            <a:graphic xmlns:a="http://schemas.openxmlformats.org/drawingml/2006/main">
+              <a:graphicData uri="http://schemas.openxmlformats.org/drawingml/2006/picture">
+                <pic:pic xmlns:pic="http://schemas.openxmlformats.org/drawingml/2006/picture">
+                  <pic:nvPicPr>
+                    <pic:cNvPr id="142612324" name="Imagen 1" descr="Imagen que contiene Aplicación&#10;&#10;El contenido generado por IA puede ser incorrecto."/>
+                    <pic:cNvPicPr/>
+                  </pic:nvPicPr>
+                  <pic:blipFill>
+                    <a:blip r:embed="rId11"/>
+                    <a:stretch>
+                      <a:fillRect/>
+                    </a:stretch>
+                  </pic:blipFill>
+                  <pic:spPr>
+                    <a:xfrm>
+                      <a:off x="0" y="0"/>
+                      <a:ext cx="3919486" cy="4391445"/>
+                    </a:xfrm>
+                    <a:prstGeom prst="rect">
+                      <a:avLst/>
+                    </a:prstGeom>
+                  </pic:spPr>
+                </pic:pic>
+              </a:graphicData>
+            </a:graphic>
+          </wp:inline>
+        </w:drawing>
+      </w:r>
+    </w:p>
+    <w:p>
+      <w:r>
+        <w:rPr>
+          <w:noProof/>
+        </w:rPr>
+        <w:lastRenderedPageBreak/>
+        <w:drawing>
+          <wp:inline distT="0" distB="0" distL="0" distR="0" wp14:anchorId="2C093F69" wp14:editId="79D277B5">
+            <wp:extent cx="3804284" cy="4163060"/>
+            <wp:effectExtent l="0" t="0" r="6350" b="0"/>
+            <wp:docPr id="182762564" name="Imagen 1" descr="Interfaz de usuario gráfica, Sitio web&#10;&#10;El contenido generado por IA puede ser incorrecto."/>
+            <wp:cNvGraphicFramePr>
+              <a:graphicFrameLocks xmlns:a="http://schemas.openxmlformats.org/drawingml/2006/main" noChangeAspect="1"/>
+            </wp:cNvGraphicFramePr>
+            <a:graphic xmlns:a="http://schemas.openxmlformats.org/drawingml/2006/main">
+              <a:graphicData uri="http://schemas.openxmlformats.org/drawingml/2006/picture">
+                <pic:pic xmlns:pic="http://schemas.openxmlformats.org/drawingml/2006/picture">
+                  <pic:nvPicPr>
+                    <pic:cNvPr id="182762564" name="Imagen 1" descr="Interfaz de usuario gráfica, Sitio web&#10;&#10;El contenido generado por IA puede ser incorrecto."/>
+                    <pic:cNvPicPr/>
+                  </pic:nvPicPr>
+                  <pic:blipFill>
+                    <a:blip r:embed="rId12"/>
+                    <a:stretch>
+                      <a:fillRect/>
+                    </a:stretch>
+                  </pic:blipFill>
+                  <pic:spPr>
+                    <a:xfrm>
+                      <a:off x="0" y="0"/>
+                      <a:ext cx="3818476" cy="4178591"/>
+                    </a:xfrm>
+                    <a:prstGeom prst="rect">
+                      <a:avLst/>
+                    </a:prstGeom>
+                  </pic:spPr>
+                </pic:pic>
+              </a:graphicData>
+            </a:graphic>
+          </wp:inline>
+        </w:drawing>
+      </w:r>
+    </w:p>
+    <w:p>
+      <w:r>
+        <w:t>No esta completa y hace falta hacer cambios aun</w:t>
+      </w:r>
+    </w:p>
+    <w:p/>
+    <w:p>
+      <w:r>
         <w:t>-</w:t>
       </w:r>
       <w:r>
@@ -244,7 +378,7 @@
       <w:r>
         <w:t xml:space="preserve"> </w:t>
       </w:r>
-      <w:hyperlink r:id="rId10" w:history="1">
+      <w:hyperlink r:id="rId13" w:history="1">
         <w:r>
           <w:rPr>
             <w:rStyle w:val="Hipervnculo"/>
@@ -268,25 +402,84 @@
     </w:p>
     <w:p>
       <w:r>
-        <w:t xml:space="preserve">Investigar </w:t>
+        <w:t>Como por ejemplo la clase eventos</w:t>
+      </w:r>
+    </w:p>
+    <w:p>
+      <w:r>
+        <w:drawing>
+          <wp:inline distT="0" distB="0" distL="0" distR="0" wp14:anchorId="0CB2F65E" wp14:editId="69359E23">
+            <wp:extent cx="5400040" cy="2189480"/>
+            <wp:effectExtent l="0" t="0" r="0" b="1270"/>
+            <wp:docPr id="732379185" name="Imagen 1"/>
+            <wp:cNvGraphicFramePr>
+              <a:graphicFrameLocks xmlns:a="http://schemas.openxmlformats.org/drawingml/2006/main" noChangeAspect="1"/>
+            </wp:cNvGraphicFramePr>
+            <a:graphic xmlns:a="http://schemas.openxmlformats.org/drawingml/2006/main">
+              <a:graphicData uri="http://schemas.openxmlformats.org/drawingml/2006/picture">
+                <pic:pic xmlns:pic="http://schemas.openxmlformats.org/drawingml/2006/picture">
+                  <pic:nvPicPr>
+                    <pic:cNvPr id="732379185" name=""/>
+                    <pic:cNvPicPr/>
+                  </pic:nvPicPr>
+                  <pic:blipFill>
+                    <a:blip r:embed="rId14"/>
+                    <a:stretch>
+                      <a:fillRect/>
+                    </a:stretch>
+                  </pic:blipFill>
+                  <pic:spPr>
+                    <a:xfrm>
+                      <a:off x="0" y="0"/>
+                      <a:ext cx="5400040" cy="2189480"/>
+                    </a:xfrm>
+                    <a:prstGeom prst="rect">
+                      <a:avLst/>
+                    </a:prstGeom>
+                  </pic:spPr>
+                </pic:pic>
+              </a:graphicData>
+            </a:graphic>
+          </wp:inline>
+        </w:drawing>
+      </w:r>
+    </w:p>
+    <w:p>
+      <w:r>
+        <w:lastRenderedPageBreak/>
+        <w:t xml:space="preserve">Esta es una muestra del código de la clase eventos en la cual no salen los </w:t>
       </w:r>
       <w:proofErr w:type="spellStart"/>
       <w:r>
-        <w:t>hashmap</w:t>
+        <w:t>getter</w:t>
       </w:r>
       <w:proofErr w:type="spellEnd"/>
-    </w:p>
-    <w:p>
-      <w:r>
-        <w:t xml:space="preserve">Esquema de la base de datos en </w:t>
+      <w:r>
+        <w:t xml:space="preserve"> y setter.</w:t>
+      </w:r>
+    </w:p>
+    <w:p>
+      <w:r>
+        <w:t xml:space="preserve">Se investiga como utilizar el </w:t>
       </w:r>
       <w:proofErr w:type="spellStart"/>
       <w:r>
-        <w:t>dia</w:t>
+        <w:t>Hashmap</w:t>
       </w:r>
       <w:proofErr w:type="spellEnd"/>
-      <w:r>
-        <w:t>.</w:t>
+    </w:p>
+    <w:p>
+      <w:r>
+        <w:t>Se hace el e</w:t>
+      </w:r>
+      <w:r>
+        <w:t xml:space="preserve">squema de la base de datos en </w:t>
+      </w:r>
+      <w:r>
+        <w:t>D</w:t>
+      </w:r>
+      <w:r>
+        <w:t>ia.</w:t>
       </w:r>
     </w:p>
     <w:p/>
@@ -296,7 +489,6 @@
         <w:rPr>
           <w:noProof/>
         </w:rPr>
-        <w:lastRenderedPageBreak/>
         <w:drawing>
           <wp:inline distT="0" distB="0" distL="0" distR="0" wp14:anchorId="57A1F5D5" wp14:editId="4FF77F2F">
             <wp:extent cx="5400040" cy="2711450"/>
@@ -313,7 +505,7 @@
                     <pic:cNvPicPr/>
                   </pic:nvPicPr>
                   <pic:blipFill>
-                    <a:blip r:embed="rId11"/>
+                    <a:blip r:embed="rId15"/>
                     <a:stretch>
                       <a:fillRect/>
                     </a:stretch>
@@ -338,11 +530,9 @@
       <w:r>
         <w:t xml:space="preserve">Creación de </w:t>
       </w:r>
-      <w:proofErr w:type="gramStart"/>
-      <w:r>
-        <w:t>las tabla</w:t>
-      </w:r>
-      <w:proofErr w:type="gramEnd"/>
+      <w:r>
+        <w:t>las tablas</w:t>
+      </w:r>
       <w:r>
         <w:t xml:space="preserve"> en base de datos</w:t>
       </w:r>
@@ -353,44 +543,40 @@
     <w:p/>
     <w:p>
       <w:r>
-        <w:t xml:space="preserve">**hay que cambiar las fotos de </w:t>
+        <w:t>Día 25-3:</w:t>
+      </w:r>
+    </w:p>
+    <w:p>
+      <w:r>
+        <w:t xml:space="preserve">Se empieza con el </w:t>
+      </w:r>
+      <w:r>
+        <w:t>HTML</w:t>
+      </w:r>
+      <w:r>
+        <w:t xml:space="preserve"> y creación de vistas </w:t>
       </w:r>
       <w:proofErr w:type="spellStart"/>
       <w:r>
-        <w:t>jpeg</w:t>
+        <w:t>mas</w:t>
       </w:r>
       <w:proofErr w:type="spellEnd"/>
       <w:r>
-        <w:t xml:space="preserve"> a web todas </w:t>
-      </w:r>
-      <w:proofErr w:type="spellStart"/>
-      <w:r>
-        <w:t>por que</w:t>
-      </w:r>
-      <w:proofErr w:type="spellEnd"/>
-      <w:r>
-        <w:t xml:space="preserve"> es mucho </w:t>
-      </w:r>
-      <w:proofErr w:type="spellStart"/>
-      <w:r>
-        <w:t>mas</w:t>
-      </w:r>
-      <w:proofErr w:type="spellEnd"/>
-      <w:r>
-        <w:t xml:space="preserve"> eficiente</w:t>
-      </w:r>
-    </w:p>
-    <w:p/>
-    <w:p>
-      <w:r>
-        <w:rPr>
-          <w:noProof/>
-        </w:rPr>
+        <w:t xml:space="preserve"> inserción de datos</w:t>
+      </w:r>
+    </w:p>
+    <w:p>
+      <w:r>
+        <w:t>Como esta tabla</w:t>
+      </w:r>
+    </w:p>
+    <w:p>
+      <w:r>
         <w:drawing>
-          <wp:inline distT="0" distB="0" distL="0" distR="0" wp14:anchorId="0821D05B" wp14:editId="19B3B606">
-            <wp:extent cx="3880819" cy="4183380"/>
-            <wp:effectExtent l="0" t="0" r="5715" b="7620"/>
-            <wp:docPr id="1950235941" name="Imagen 1" descr="Diagrama&#10;&#10;El contenido generado por IA puede ser incorrecto."/>
+          <wp:inline distT="0" distB="0" distL="0" distR="0" wp14:anchorId="31C0B1AD" wp14:editId="48542C2A">
+            <wp:extent cx="5400040" cy="1979295"/>
+            <wp:effectExtent l="0" t="0" r="0" b="1905"/>
+            <wp:docPr id="39798933" name="Imagen 1"/>
             <wp:cNvGraphicFramePr>
               <a:graphicFrameLocks xmlns:a="http://schemas.openxmlformats.org/drawingml/2006/main" noChangeAspect="1"/>
             </wp:cNvGraphicFramePr>
@@ -398,11 +584,11 @@
               <a:graphicData uri="http://schemas.openxmlformats.org/drawingml/2006/picture">
                 <pic:pic xmlns:pic="http://schemas.openxmlformats.org/drawingml/2006/picture">
                   <pic:nvPicPr>
-                    <pic:cNvPr id="1950235941" name="Imagen 1" descr="Diagrama&#10;&#10;El contenido generado por IA puede ser incorrecto."/>
+                    <pic:cNvPr id="39798933" name=""/>
                     <pic:cNvPicPr/>
                   </pic:nvPicPr>
                   <pic:blipFill>
-                    <a:blip r:embed="rId12"/>
+                    <a:blip r:embed="rId16"/>
                     <a:stretch>
                       <a:fillRect/>
                     </a:stretch>
@@ -410,7 +596,7 @@
                   <pic:spPr>
                     <a:xfrm>
                       <a:off x="0" y="0"/>
-                      <a:ext cx="3889747" cy="4193004"/>
+                      <a:ext cx="5400040" cy="1979295"/>
                     </a:xfrm>
                     <a:prstGeom prst="rect">
                       <a:avLst/>
@@ -425,15 +611,17 @@
     </w:p>
     <w:p>
       <w:r>
-        <w:rPr>
-          <w:noProof/>
-        </w:rPr>
+        <w:t>O esta vista</w:t>
+      </w:r>
+    </w:p>
+    <w:p>
+      <w:r>
         <w:lastRenderedPageBreak/>
         <w:drawing>
-          <wp:inline distT="0" distB="0" distL="0" distR="0" wp14:anchorId="76D7D508" wp14:editId="07858B06">
-            <wp:extent cx="3909060" cy="4379764"/>
+          <wp:inline distT="0" distB="0" distL="0" distR="0" wp14:anchorId="69110333" wp14:editId="13A09E44">
+            <wp:extent cx="5400040" cy="1788795"/>
             <wp:effectExtent l="0" t="0" r="0" b="1905"/>
-            <wp:docPr id="142612324" name="Imagen 1" descr="Imagen que contiene Aplicación&#10;&#10;El contenido generado por IA puede ser incorrecto."/>
+            <wp:docPr id="2111991726" name="Imagen 1"/>
             <wp:cNvGraphicFramePr>
               <a:graphicFrameLocks xmlns:a="http://schemas.openxmlformats.org/drawingml/2006/main" noChangeAspect="1"/>
             </wp:cNvGraphicFramePr>
@@ -441,11 +629,11 @@
               <a:graphicData uri="http://schemas.openxmlformats.org/drawingml/2006/picture">
                 <pic:pic xmlns:pic="http://schemas.openxmlformats.org/drawingml/2006/picture">
                   <pic:nvPicPr>
-                    <pic:cNvPr id="142612324" name="Imagen 1" descr="Imagen que contiene Aplicación&#10;&#10;El contenido generado por IA puede ser incorrecto."/>
+                    <pic:cNvPr id="2111991726" name=""/>
                     <pic:cNvPicPr/>
                   </pic:nvPicPr>
                   <pic:blipFill>
-                    <a:blip r:embed="rId13"/>
+                    <a:blip r:embed="rId17"/>
                     <a:stretch>
                       <a:fillRect/>
                     </a:stretch>
@@ -453,7 +641,7 @@
                   <pic:spPr>
                     <a:xfrm>
                       <a:off x="0" y="0"/>
-                      <a:ext cx="3919486" cy="4391445"/>
+                      <a:ext cx="5400040" cy="1788795"/>
                     </a:xfrm>
                     <a:prstGeom prst="rect">
                       <a:avLst/>
@@ -468,14 +656,40 @@
     </w:p>
     <w:p>
       <w:r>
-        <w:rPr>
-          <w:noProof/>
-        </w:rPr>
+        <w:t>Día 26-3:</w:t>
+      </w:r>
+    </w:p>
+    <w:p>
+      <w:r>
+        <w:t>Se continua con la inserción de datos, solucionar algunos fallos en la base de datos y arreglar las vistas</w:t>
+      </w:r>
+      <w:r>
+        <w:t xml:space="preserve">, funciona todo excepto por que con el </w:t>
+      </w:r>
+      <w:proofErr w:type="spellStart"/>
+      <w:r>
+        <w:t>user</w:t>
+      </w:r>
+      <w:proofErr w:type="spellEnd"/>
+      <w:r>
+        <w:t xml:space="preserve"> proyecto no deja tiene que ser con el </w:t>
+      </w:r>
+      <w:proofErr w:type="spellStart"/>
+      <w:r>
+        <w:t>admin</w:t>
+      </w:r>
+      <w:proofErr w:type="spellEnd"/>
+      <w:r>
+        <w:t>.</w:t>
+      </w:r>
+    </w:p>
+    <w:p>
+      <w:r>
         <w:drawing>
-          <wp:inline distT="0" distB="0" distL="0" distR="0" wp14:anchorId="6156E383" wp14:editId="5EAB0A8A">
-            <wp:extent cx="3804284" cy="4163060"/>
-            <wp:effectExtent l="0" t="0" r="6350" b="0"/>
-            <wp:docPr id="182762564" name="Imagen 1" descr="Interfaz de usuario gráfica, Sitio web&#10;&#10;El contenido generado por IA puede ser incorrecto."/>
+          <wp:inline distT="0" distB="0" distL="0" distR="0" wp14:anchorId="22F1137B" wp14:editId="2BC0D7BD">
+            <wp:extent cx="5400040" cy="1010920"/>
+            <wp:effectExtent l="0" t="0" r="0" b="0"/>
+            <wp:docPr id="1139947884" name="Imagen 1"/>
             <wp:cNvGraphicFramePr>
               <a:graphicFrameLocks xmlns:a="http://schemas.openxmlformats.org/drawingml/2006/main" noChangeAspect="1"/>
             </wp:cNvGraphicFramePr>
@@ -483,11 +697,11 @@
               <a:graphicData uri="http://schemas.openxmlformats.org/drawingml/2006/picture">
                 <pic:pic xmlns:pic="http://schemas.openxmlformats.org/drawingml/2006/picture">
                   <pic:nvPicPr>
-                    <pic:cNvPr id="182762564" name="Imagen 1" descr="Interfaz de usuario gráfica, Sitio web&#10;&#10;El contenido generado por IA puede ser incorrecto."/>
+                    <pic:cNvPr id="1139947884" name=""/>
                     <pic:cNvPicPr/>
                   </pic:nvPicPr>
                   <pic:blipFill>
-                    <a:blip r:embed="rId14"/>
+                    <a:blip r:embed="rId18"/>
                     <a:stretch>
                       <a:fillRect/>
                     </a:stretch>
@@ -495,7 +709,7 @@
                   <pic:spPr>
                     <a:xfrm>
                       <a:off x="0" y="0"/>
-                      <a:ext cx="3818476" cy="4178591"/>
+                      <a:ext cx="5400040" cy="1010920"/>
                     </a:xfrm>
                     <a:prstGeom prst="rect">
                       <a:avLst/>
@@ -510,91 +724,76 @@
     </w:p>
     <w:p>
       <w:r>
+        <w:t>Muestra de la inserción de datos de la tabla usuarios</w:t>
+      </w:r>
+    </w:p>
+    <w:p>
+      <w:r>
+        <w:t>Se mejora el diseño en figma</w:t>
+      </w:r>
+      <w:r>
+        <w:br/>
+      </w:r>
+      <w:r>
+        <w:t>creación de dos métodos en proyecto java</w:t>
+      </w:r>
+    </w:p>
+    <w:p>
+      <w:r>
+        <w:t>Muestra del método para añadir usuario</w:t>
+      </w:r>
+    </w:p>
+    <w:p>
+      <w:r>
+        <w:drawing>
+          <wp:inline distT="0" distB="0" distL="0" distR="0" wp14:anchorId="51C663EC" wp14:editId="1C748AE7">
+            <wp:extent cx="5400040" cy="3042920"/>
+            <wp:effectExtent l="0" t="0" r="0" b="5080"/>
+            <wp:docPr id="1881635429" name="Imagen 1"/>
+            <wp:cNvGraphicFramePr>
+              <a:graphicFrameLocks xmlns:a="http://schemas.openxmlformats.org/drawingml/2006/main" noChangeAspect="1"/>
+            </wp:cNvGraphicFramePr>
+            <a:graphic xmlns:a="http://schemas.openxmlformats.org/drawingml/2006/main">
+              <a:graphicData uri="http://schemas.openxmlformats.org/drawingml/2006/picture">
+                <pic:pic xmlns:pic="http://schemas.openxmlformats.org/drawingml/2006/picture">
+                  <pic:nvPicPr>
+                    <pic:cNvPr id="1881635429" name=""/>
+                    <pic:cNvPicPr/>
+                  </pic:nvPicPr>
+                  <pic:blipFill>
+                    <a:blip r:embed="rId19"/>
+                    <a:stretch>
+                      <a:fillRect/>
+                    </a:stretch>
+                  </pic:blipFill>
+                  <pic:spPr>
+                    <a:xfrm>
+                      <a:off x="0" y="0"/>
+                      <a:ext cx="5400040" cy="3042920"/>
+                    </a:xfrm>
+                    <a:prstGeom prst="rect">
+                      <a:avLst/>
+                    </a:prstGeom>
+                  </pic:spPr>
+                </pic:pic>
+              </a:graphicData>
+            </a:graphic>
+          </wp:inline>
+        </w:drawing>
+      </w:r>
+    </w:p>
+    <w:p/>
+    <w:p>
+      <w:r>
         <w:lastRenderedPageBreak/>
-        <w:t>Día 25-3:</w:t>
-      </w:r>
-    </w:p>
-    <w:p>
-      <w:r>
-        <w:t xml:space="preserve">Se empieza con el </w:t>
-      </w:r>
-      <w:proofErr w:type="spellStart"/>
-      <w:r>
-        <w:t>html</w:t>
-      </w:r>
-      <w:proofErr w:type="spellEnd"/>
-      <w:r>
-        <w:t xml:space="preserve"> y creación de vistas </w:t>
-      </w:r>
-      <w:proofErr w:type="spellStart"/>
-      <w:r>
-        <w:t>mas</w:t>
-      </w:r>
-      <w:proofErr w:type="spellEnd"/>
-      <w:r>
-        <w:t xml:space="preserve"> inserción de datos</w:t>
-      </w:r>
-    </w:p>
-    <w:p>
-      <w:r>
-        <w:t>Día 26-3:</w:t>
-      </w:r>
-    </w:p>
-    <w:p>
-      <w:r>
-        <w:t>Se continua con la inserción de datos, solucionar algunos fallos en la base de datos y arreglar las vistas</w:t>
-      </w:r>
-      <w:r>
-        <w:t xml:space="preserve">, funciona todo excepto por que con el </w:t>
-      </w:r>
-      <w:proofErr w:type="spellStart"/>
-      <w:r>
-        <w:t>user</w:t>
-      </w:r>
-      <w:proofErr w:type="spellEnd"/>
-      <w:r>
-        <w:t xml:space="preserve"> proyecto no deja tiene que ser con el </w:t>
-      </w:r>
-      <w:proofErr w:type="spellStart"/>
-      <w:r>
-        <w:t>admin</w:t>
-      </w:r>
-      <w:proofErr w:type="spellEnd"/>
-      <w:r>
-        <w:t>,</w:t>
-      </w:r>
-    </w:p>
-    <w:p>
-      <w:r>
-        <w:t>Se mejora el diseño en figma</w:t>
-      </w:r>
-      <w:r>
-        <w:br/>
-      </w:r>
-      <w:r>
-        <w:t>creación de dos métodos en proyecto java</w:t>
-      </w:r>
-    </w:p>
-    <w:p/>
-    <w:p>
-      <w:r>
         <w:t>Dia 27-3:</w:t>
       </w:r>
     </w:p>
     <w:p>
       <w:r>
-        <w:t xml:space="preserve">Crear </w:t>
-      </w:r>
-      <w:proofErr w:type="spellStart"/>
-      <w:r>
-        <w:t>mas</w:t>
-      </w:r>
-      <w:proofErr w:type="spellEnd"/>
-      <w:r>
-        <w:t xml:space="preserve"> métodos de java</w:t>
-      </w:r>
-    </w:p>
-    <w:p/>
+        <w:t>Se continua con el proyecto en java y se arreglan errores</w:t>
+      </w:r>
+    </w:p>
     <w:p/>
     <w:p/>
     <w:sectPr>

</xml_diff>

<commit_message>
Continuar la creacion del index
</commit_message>
<xml_diff>
--- a/proyecto_informe.docx
+++ b/proyecto_informe.docx
@@ -407,6 +407,9 @@
     </w:p>
     <w:p>
       <w:r>
+        <w:rPr>
+          <w:noProof/>
+        </w:rPr>
         <w:drawing>
           <wp:inline distT="0" distB="0" distL="0" distR="0" wp14:anchorId="0CB2F65E" wp14:editId="69359E23">
             <wp:extent cx="5400040" cy="2189480"/>
@@ -572,6 +575,9 @@
     </w:p>
     <w:p>
       <w:r>
+        <w:rPr>
+          <w:noProof/>
+        </w:rPr>
         <w:drawing>
           <wp:inline distT="0" distB="0" distL="0" distR="0" wp14:anchorId="31C0B1AD" wp14:editId="48542C2A">
             <wp:extent cx="5400040" cy="1979295"/>
@@ -616,6 +622,9 @@
     </w:p>
     <w:p>
       <w:r>
+        <w:rPr>
+          <w:noProof/>
+        </w:rPr>
         <w:lastRenderedPageBreak/>
         <w:drawing>
           <wp:inline distT="0" distB="0" distL="0" distR="0" wp14:anchorId="69110333" wp14:editId="13A09E44">
@@ -685,6 +694,9 @@
     </w:p>
     <w:p>
       <w:r>
+        <w:rPr>
+          <w:noProof/>
+        </w:rPr>
         <w:drawing>
           <wp:inline distT="0" distB="0" distL="0" distR="0" wp14:anchorId="22F1137B" wp14:editId="2BC0D7BD">
             <wp:extent cx="5400040" cy="1010920"/>
@@ -745,6 +757,9 @@
     </w:p>
     <w:p>
       <w:r>
+        <w:rPr>
+          <w:noProof/>
+        </w:rPr>
         <w:drawing>
           <wp:inline distT="0" distB="0" distL="0" distR="0" wp14:anchorId="51C663EC" wp14:editId="1C748AE7">
             <wp:extent cx="5400040" cy="3042920"/>
@@ -794,6 +809,18 @@
         <w:t>Se continua con el proyecto en java y se arreglan errores</w:t>
       </w:r>
     </w:p>
+    <w:p/>
+    <w:p>
+      <w:r>
+        <w:t>Dia 6-4:</w:t>
+      </w:r>
+    </w:p>
+    <w:p>
+      <w:r>
+        <w:t>Se arreglan algunos errores y se terminar el proyecto en java.</w:t>
+      </w:r>
+    </w:p>
+    <w:p/>
     <w:p/>
     <w:p/>
     <w:sectPr>

</xml_diff>

<commit_message>
Cambios en el index, arreglo de errores y creacion de las demas secciones de la web
</commit_message>
<xml_diff>
--- a/proyecto_informe.docx
+++ b/proyecto_informe.docx
@@ -8,13 +8,8 @@
       </w:r>
     </w:p>
     <w:p>
-      <w:proofErr w:type="gramStart"/>
-      <w:r>
-        <w:t>Link</w:t>
-      </w:r>
-      <w:proofErr w:type="gramEnd"/>
-      <w:r>
-        <w:t xml:space="preserve"> de GIT: </w:t>
+      <w:r>
+        <w:t xml:space="preserve">Link de GIT: </w:t>
       </w:r>
       <w:hyperlink r:id="rId5" w:history="1">
         <w:r>
@@ -46,26 +41,13 @@
         <w:t>á</w:t>
       </w:r>
       <w:r>
-        <w:t xml:space="preserve">ginas web en las que </w:t>
-      </w:r>
-      <w:proofErr w:type="spellStart"/>
-      <w:r>
-        <w:t>est</w:t>
+        <w:t>ginas web en las que est</w:t>
       </w:r>
       <w:r>
         <w:t>a</w:t>
       </w:r>
-      <w:proofErr w:type="spellEnd"/>
-      <w:r>
-        <w:t xml:space="preserve"> inspirado</w:t>
-      </w:r>
-      <w:proofErr w:type="gramStart"/>
-      <w:r>
-        <w:t>:  (</w:t>
-      </w:r>
-      <w:proofErr w:type="gramEnd"/>
-      <w:r>
-        <w:t>poner q ha gustado que no)</w:t>
+      <w:r>
+        <w:t xml:space="preserve"> inspirado:  (poner q ha gustado que no)</w:t>
       </w:r>
     </w:p>
     <w:p>
@@ -93,23 +75,7 @@
         <w:ind w:left="708"/>
       </w:pPr>
       <w:r>
-        <w:t xml:space="preserve">Me ha gustado como </w:t>
-      </w:r>
-      <w:proofErr w:type="spellStart"/>
-      <w:r>
-        <w:t>esta</w:t>
-      </w:r>
-      <w:proofErr w:type="spellEnd"/>
-      <w:r>
-        <w:t xml:space="preserve"> organizada la información excepto por lo que no me gusta que </w:t>
-      </w:r>
-      <w:proofErr w:type="gramStart"/>
-      <w:r>
-        <w:t>es</w:t>
-      </w:r>
-      <w:proofErr w:type="gramEnd"/>
-      <w:r>
-        <w:t xml:space="preserve"> la forma de organizar la información por días.</w:t>
+        <w:t>Me ha gustado como esta organizada la información excepto por lo que no me gusta que es la forma de organizar la información por días.</w:t>
       </w:r>
     </w:p>
     <w:p>
@@ -346,31 +312,7 @@
         <w:t>Esquema</w:t>
       </w:r>
       <w:r>
-        <w:t xml:space="preserve"> de </w:t>
-      </w:r>
-      <w:proofErr w:type="spellStart"/>
-      <w:r>
-        <w:t>como</w:t>
-      </w:r>
-      <w:proofErr w:type="spellEnd"/>
-      <w:r>
-        <w:t xml:space="preserve"> se va a ver la </w:t>
-      </w:r>
-      <w:proofErr w:type="spellStart"/>
-      <w:r>
-        <w:t>pagina</w:t>
-      </w:r>
-      <w:proofErr w:type="spellEnd"/>
-      <w:r>
-        <w:t>(</w:t>
-      </w:r>
-      <w:proofErr w:type="spellStart"/>
-      <w:r>
-        <w:t>wireframe</w:t>
-      </w:r>
-      <w:proofErr w:type="spellEnd"/>
-      <w:r>
-        <w:t>)</w:t>
+        <w:t xml:space="preserve"> de como se va a ver la pagina(wireframe)</w:t>
       </w:r>
       <w:r>
         <w:t xml:space="preserve">: </w:t>
@@ -450,26 +392,13 @@
     <w:p>
       <w:r>
         <w:lastRenderedPageBreak/>
-        <w:t xml:space="preserve">Esta es una muestra del código de la clase eventos en la cual no salen los </w:t>
-      </w:r>
-      <w:proofErr w:type="spellStart"/>
-      <w:r>
-        <w:t>getter</w:t>
-      </w:r>
-      <w:proofErr w:type="spellEnd"/>
-      <w:r>
-        <w:t xml:space="preserve"> y setter.</w:t>
-      </w:r>
-    </w:p>
-    <w:p>
-      <w:r>
-        <w:t xml:space="preserve">Se investiga como utilizar el </w:t>
-      </w:r>
-      <w:proofErr w:type="spellStart"/>
-      <w:r>
-        <w:t>Hashmap</w:t>
-      </w:r>
-      <w:proofErr w:type="spellEnd"/>
+        <w:t>Esta es una muestra del código de la clase eventos en la cual no salen los getter y setter.</w:t>
+      </w:r>
+    </w:p>
+    <w:p>
+      <w:r>
+        <w:t>Se investiga como utilizar el Hashmap</w:t>
+      </w:r>
     </w:p>
     <w:p>
       <w:r>
@@ -557,15 +486,7 @@
         <w:t>HTML</w:t>
       </w:r>
       <w:r>
-        <w:t xml:space="preserve"> y creación de vistas </w:t>
-      </w:r>
-      <w:proofErr w:type="spellStart"/>
-      <w:r>
-        <w:t>mas</w:t>
-      </w:r>
-      <w:proofErr w:type="spellEnd"/>
-      <w:r>
-        <w:t xml:space="preserve"> inserción de datos</w:t>
+        <w:t xml:space="preserve"> y creación de vistas mas inserción de datos</w:t>
       </w:r>
     </w:p>
     <w:p>
@@ -673,21 +594,8 @@
         <w:t>Se continua con la inserción de datos, solucionar algunos fallos en la base de datos y arreglar las vistas</w:t>
       </w:r>
       <w:r>
-        <w:t xml:space="preserve">, funciona todo excepto por que con el </w:t>
-      </w:r>
-      <w:proofErr w:type="spellStart"/>
-      <w:r>
-        <w:t>user</w:t>
-      </w:r>
-      <w:proofErr w:type="spellEnd"/>
-      <w:r>
-        <w:t xml:space="preserve"> proyecto no deja tiene que ser con el </w:t>
-      </w:r>
-      <w:proofErr w:type="spellStart"/>
-      <w:r>
-        <w:t>admin</w:t>
-      </w:r>
-      <w:proofErr w:type="spellEnd"/>
+        <w:t>, funciona todo excepto por que con el user proyecto no deja tiene que ser con el admin</w:t>
+      </w:r>
       <w:r>
         <w:t>.</w:t>
       </w:r>
@@ -818,6 +726,26 @@
     <w:p>
       <w:r>
         <w:t>Se arreglan algunos errores y se terminar el proyecto en java.</w:t>
+      </w:r>
+    </w:p>
+    <w:p>
+      <w:r>
+        <w:t xml:space="preserve">Dia 7-4 </w:t>
+      </w:r>
+    </w:p>
+    <w:p>
+      <w:r>
+        <w:t>Mejorar y arreglar el index</w:t>
+      </w:r>
+    </w:p>
+    <w:p>
+      <w:r>
+        <w:t>Dia 8-4</w:t>
+      </w:r>
+    </w:p>
+    <w:p>
+      <w:r>
+        <w:t>Mejorar y arrglar el index + crear el resto de secciones de la pagina y arreglar errores</w:t>
       </w:r>
     </w:p>
     <w:p/>

</xml_diff>

<commit_message>
Cambios y arreglos en las secciones principales de la pagina y cambios de eventos, y rehacer algunos de los eventos del historial
</commit_message>
<xml_diff>
--- a/proyecto_informe.docx
+++ b/proyecto_informe.docx
@@ -8,8 +8,13 @@
       </w:r>
     </w:p>
     <w:p>
-      <w:r>
-        <w:t xml:space="preserve">Link de GIT: </w:t>
+      <w:proofErr w:type="gramStart"/>
+      <w:r>
+        <w:t>Link</w:t>
+      </w:r>
+      <w:proofErr w:type="gramEnd"/>
+      <w:r>
+        <w:t xml:space="preserve"> de GIT: </w:t>
       </w:r>
       <w:hyperlink r:id="rId5" w:history="1">
         <w:r>
@@ -41,13 +46,26 @@
         <w:t>á</w:t>
       </w:r>
       <w:r>
-        <w:t>ginas web en las que est</w:t>
+        <w:t xml:space="preserve">ginas web en las que </w:t>
+      </w:r>
+      <w:proofErr w:type="spellStart"/>
+      <w:r>
+        <w:t>est</w:t>
       </w:r>
       <w:r>
         <w:t>a</w:t>
       </w:r>
-      <w:r>
-        <w:t xml:space="preserve"> inspirado:  (poner q ha gustado que no)</w:t>
+      <w:proofErr w:type="spellEnd"/>
+      <w:r>
+        <w:t xml:space="preserve"> inspirado</w:t>
+      </w:r>
+      <w:proofErr w:type="gramStart"/>
+      <w:r>
+        <w:t>:  (</w:t>
+      </w:r>
+      <w:proofErr w:type="gramEnd"/>
+      <w:r>
+        <w:t>poner q ha gustado que no)</w:t>
       </w:r>
     </w:p>
     <w:p>
@@ -75,7 +93,23 @@
         <w:ind w:left="708"/>
       </w:pPr>
       <w:r>
-        <w:t>Me ha gustado como esta organizada la información excepto por lo que no me gusta que es la forma de organizar la información por días.</w:t>
+        <w:t xml:space="preserve">Me ha gustado como </w:t>
+      </w:r>
+      <w:proofErr w:type="spellStart"/>
+      <w:r>
+        <w:t>esta</w:t>
+      </w:r>
+      <w:proofErr w:type="spellEnd"/>
+      <w:r>
+        <w:t xml:space="preserve"> organizada la información excepto por lo que no me gusta que </w:t>
+      </w:r>
+      <w:proofErr w:type="gramStart"/>
+      <w:r>
+        <w:t>es</w:t>
+      </w:r>
+      <w:proofErr w:type="gramEnd"/>
+      <w:r>
+        <w:t xml:space="preserve"> la forma de organizar la información por días.</w:t>
       </w:r>
     </w:p>
     <w:p>
@@ -137,7 +171,15 @@
         <w:ind w:left="708"/>
       </w:pPr>
       <w:r>
-        <w:t>Me gusta que la información este dispuesta de forma visual pero no me gusta que algunas imágenes salen deformadas</w:t>
+        <w:t xml:space="preserve">Me gusta que la información </w:t>
+      </w:r>
+      <w:proofErr w:type="spellStart"/>
+      <w:r>
+        <w:t>este</w:t>
+      </w:r>
+      <w:proofErr w:type="spellEnd"/>
+      <w:r>
+        <w:t xml:space="preserve"> dispuesta de forma visual pero no me gusta que algunas imágenes salen deformadas</w:t>
       </w:r>
     </w:p>
     <w:p>
@@ -300,7 +342,15 @@
     </w:p>
     <w:p>
       <w:r>
-        <w:t>No esta completa y hace falta hacer cambios aun</w:t>
+        <w:t xml:space="preserve">No </w:t>
+      </w:r>
+      <w:proofErr w:type="spellStart"/>
+      <w:r>
+        <w:t>esta</w:t>
+      </w:r>
+      <w:proofErr w:type="spellEnd"/>
+      <w:r>
+        <w:t xml:space="preserve"> completa y hace falta hacer cambios aun</w:t>
       </w:r>
     </w:p>
     <w:p/>
@@ -312,7 +362,31 @@
         <w:t>Esquema</w:t>
       </w:r>
       <w:r>
-        <w:t xml:space="preserve"> de como se va a ver la pagina(wireframe)</w:t>
+        <w:t xml:space="preserve"> de </w:t>
+      </w:r>
+      <w:proofErr w:type="spellStart"/>
+      <w:r>
+        <w:t>como</w:t>
+      </w:r>
+      <w:proofErr w:type="spellEnd"/>
+      <w:r>
+        <w:t xml:space="preserve"> se va a ver la </w:t>
+      </w:r>
+      <w:proofErr w:type="spellStart"/>
+      <w:r>
+        <w:t>pagina</w:t>
+      </w:r>
+      <w:proofErr w:type="spellEnd"/>
+      <w:r>
+        <w:t>(</w:t>
+      </w:r>
+      <w:proofErr w:type="spellStart"/>
+      <w:r>
+        <w:t>wireframe</w:t>
+      </w:r>
+      <w:proofErr w:type="spellEnd"/>
+      <w:r>
+        <w:t>)</w:t>
       </w:r>
       <w:r>
         <w:t xml:space="preserve">: </w:t>
@@ -392,13 +466,26 @@
     <w:p>
       <w:r>
         <w:lastRenderedPageBreak/>
-        <w:t>Esta es una muestra del código de la clase eventos en la cual no salen los getter y setter.</w:t>
-      </w:r>
-    </w:p>
-    <w:p>
-      <w:r>
-        <w:t>Se investiga como utilizar el Hashmap</w:t>
-      </w:r>
+        <w:t xml:space="preserve">Esta es una muestra del código de la clase eventos en la cual no salen los </w:t>
+      </w:r>
+      <w:proofErr w:type="spellStart"/>
+      <w:r>
+        <w:t>getter</w:t>
+      </w:r>
+      <w:proofErr w:type="spellEnd"/>
+      <w:r>
+        <w:t xml:space="preserve"> y setter.</w:t>
+      </w:r>
+    </w:p>
+    <w:p>
+      <w:r>
+        <w:t xml:space="preserve">Se investiga como utilizar el </w:t>
+      </w:r>
+      <w:proofErr w:type="spellStart"/>
+      <w:r>
+        <w:t>Hashmap</w:t>
+      </w:r>
+      <w:proofErr w:type="spellEnd"/>
     </w:p>
     <w:p>
       <w:r>
@@ -486,7 +573,15 @@
         <w:t>HTML</w:t>
       </w:r>
       <w:r>
-        <w:t xml:space="preserve"> y creación de vistas mas inserción de datos</w:t>
+        <w:t xml:space="preserve"> y creación de vistas </w:t>
+      </w:r>
+      <w:proofErr w:type="spellStart"/>
+      <w:r>
+        <w:t>mas</w:t>
+      </w:r>
+      <w:proofErr w:type="spellEnd"/>
+      <w:r>
+        <w:t xml:space="preserve"> inserción de datos</w:t>
       </w:r>
     </w:p>
     <w:p>
@@ -594,8 +689,21 @@
         <w:t>Se continua con la inserción de datos, solucionar algunos fallos en la base de datos y arreglar las vistas</w:t>
       </w:r>
       <w:r>
-        <w:t>, funciona todo excepto por que con el user proyecto no deja tiene que ser con el admin</w:t>
-      </w:r>
+        <w:t xml:space="preserve">, funciona todo excepto por que con el </w:t>
+      </w:r>
+      <w:proofErr w:type="spellStart"/>
+      <w:r>
+        <w:t>user</w:t>
+      </w:r>
+      <w:proofErr w:type="spellEnd"/>
+      <w:r>
+        <w:t xml:space="preserve"> proyecto no deja tiene que ser con el </w:t>
+      </w:r>
+      <w:proofErr w:type="spellStart"/>
+      <w:r>
+        <w:t>admin</w:t>
+      </w:r>
+      <w:proofErr w:type="spellEnd"/>
       <w:r>
         <w:t>.</w:t>
       </w:r>
@@ -649,8 +757,13 @@
     </w:p>
     <w:p>
       <w:r>
-        <w:t>Se mejora el diseño en figma</w:t>
-      </w:r>
+        <w:t xml:space="preserve">Se mejora el diseño en </w:t>
+      </w:r>
+      <w:proofErr w:type="spellStart"/>
+      <w:r>
+        <w:t>figma</w:t>
+      </w:r>
+      <w:proofErr w:type="spellEnd"/>
       <w:r>
         <w:br/>
       </w:r>
@@ -735,8 +848,13 @@
     </w:p>
     <w:p>
       <w:r>
-        <w:t>Mejorar y arreglar el index</w:t>
-      </w:r>
+        <w:t xml:space="preserve">Mejorar y arreglar el </w:t>
+      </w:r>
+      <w:proofErr w:type="spellStart"/>
+      <w:r>
+        <w:t>index</w:t>
+      </w:r>
+      <w:proofErr w:type="spellEnd"/>
     </w:p>
     <w:p>
       <w:r>
@@ -745,7 +863,49 @@
     </w:p>
     <w:p>
       <w:r>
-        <w:t>Mejorar y arrglar el index + crear el resto de secciones de la pagina y arreglar errores</w:t>
+        <w:t xml:space="preserve">Mejorar y </w:t>
+      </w:r>
+      <w:proofErr w:type="spellStart"/>
+      <w:r>
+        <w:t>arrglar</w:t>
+      </w:r>
+      <w:proofErr w:type="spellEnd"/>
+      <w:r>
+        <w:t xml:space="preserve"> el </w:t>
+      </w:r>
+      <w:proofErr w:type="spellStart"/>
+      <w:r>
+        <w:t>index</w:t>
+      </w:r>
+      <w:proofErr w:type="spellEnd"/>
+      <w:r>
+        <w:t xml:space="preserve"> + crear el resto de </w:t>
+      </w:r>
+      <w:proofErr w:type="gramStart"/>
+      <w:r>
+        <w:t>secciones</w:t>
+      </w:r>
+      <w:proofErr w:type="gramEnd"/>
+      <w:r>
+        <w:t xml:space="preserve"> de la </w:t>
+      </w:r>
+      <w:proofErr w:type="spellStart"/>
+      <w:r>
+        <w:t>pagina</w:t>
+      </w:r>
+      <w:proofErr w:type="spellEnd"/>
+      <w:r>
+        <w:t xml:space="preserve"> y arreglar errores</w:t>
+      </w:r>
+    </w:p>
+    <w:p>
+      <w:r>
+        <w:t>Dia 10-4:</w:t>
+      </w:r>
+    </w:p>
+    <w:p>
+      <w:r>
+        <w:t>Cambiar todos los eventos del historial por que la estructura esta mal hecha y no permite meter las galerias</w:t>
       </w:r>
     </w:p>
     <w:p/>

</xml_diff>

<commit_message>
Cambio de textos en sobre nosotros y creacion y avance en el rss
</commit_message>
<xml_diff>
--- a/proyecto_informe.docx
+++ b/proyecto_informe.docx
@@ -8,13 +8,8 @@
       </w:r>
     </w:p>
     <w:p>
-      <w:proofErr w:type="gramStart"/>
-      <w:r>
-        <w:t>Link</w:t>
-      </w:r>
-      <w:proofErr w:type="gramEnd"/>
-      <w:r>
-        <w:t xml:space="preserve"> de GIT: </w:t>
+      <w:r>
+        <w:t xml:space="preserve">Link de GIT: </w:t>
       </w:r>
       <w:hyperlink r:id="rId5" w:history="1">
         <w:r>
@@ -57,15 +52,7 @@
       </w:r>
       <w:proofErr w:type="spellEnd"/>
       <w:r>
-        <w:t xml:space="preserve"> inspirado</w:t>
-      </w:r>
-      <w:proofErr w:type="gramStart"/>
-      <w:r>
-        <w:t>:  (</w:t>
-      </w:r>
-      <w:proofErr w:type="gramEnd"/>
-      <w:r>
-        <w:t>poner q ha gustado que no)</w:t>
+        <w:t xml:space="preserve"> inspirado:  (poner q ha gustado que no)</w:t>
       </w:r>
     </w:p>
     <w:p>
@@ -101,15 +88,7 @@
       </w:r>
       <w:proofErr w:type="spellEnd"/>
       <w:r>
-        <w:t xml:space="preserve"> organizada la información excepto por lo que no me gusta que </w:t>
-      </w:r>
-      <w:proofErr w:type="gramStart"/>
-      <w:r>
-        <w:t>es</w:t>
-      </w:r>
-      <w:proofErr w:type="gramEnd"/>
-      <w:r>
-        <w:t xml:space="preserve"> la forma de organizar la información por días.</w:t>
+        <w:t xml:space="preserve"> organizada la información excepto por lo que no me gusta que es la forma de organizar la información por días.</w:t>
       </w:r>
     </w:p>
     <w:p>
@@ -879,15 +858,7 @@
       </w:r>
       <w:proofErr w:type="spellEnd"/>
       <w:r>
-        <w:t xml:space="preserve"> + crear el resto de </w:t>
-      </w:r>
-      <w:proofErr w:type="gramStart"/>
-      <w:r>
-        <w:t>secciones</w:t>
-      </w:r>
-      <w:proofErr w:type="gramEnd"/>
-      <w:r>
-        <w:t xml:space="preserve"> de la </w:t>
+        <w:t xml:space="preserve"> + crear el resto de secciones de la </w:t>
       </w:r>
       <w:proofErr w:type="spellStart"/>
       <w:r>
@@ -905,10 +876,108 @@
     </w:p>
     <w:p>
       <w:r>
-        <w:t>Cambiar todos los eventos del historial por que la estructura esta mal hecha y no permite meter las galerias</w:t>
-      </w:r>
-    </w:p>
-    <w:p/>
+        <w:t xml:space="preserve">Cambiar todos los eventos del historial por que la estructura esta mal hecha y no permite meter las </w:t>
+      </w:r>
+      <w:r>
+        <w:t>galerías</w:t>
+      </w:r>
+    </w:p>
+    <w:p>
+      <w:r>
+        <w:t>Dia 13-4:</w:t>
+      </w:r>
+    </w:p>
+    <w:p>
+      <w:r>
+        <w:t>Cambiar todos los eventos del historial para que acepten las galerías</w:t>
+      </w:r>
+    </w:p>
+    <w:p>
+      <w:r>
+        <w:t>Dia 14-4:</w:t>
+      </w:r>
+    </w:p>
+    <w:p>
+      <w:r>
+        <w:t xml:space="preserve">Se crea el </w:t>
+      </w:r>
+      <w:proofErr w:type="spellStart"/>
+      <w:r>
+        <w:t>rss</w:t>
+      </w:r>
+      <w:proofErr w:type="spellEnd"/>
+      <w:r>
+        <w:t xml:space="preserve"> de próximos eventos en un archivo </w:t>
+      </w:r>
+      <w:proofErr w:type="spellStart"/>
+      <w:r>
+        <w:t>xml</w:t>
+      </w:r>
+      <w:proofErr w:type="spellEnd"/>
+      <w:r>
+        <w:t xml:space="preserve"> y se conecta al </w:t>
+      </w:r>
+      <w:proofErr w:type="spellStart"/>
+      <w:r>
+        <w:t>html</w:t>
+      </w:r>
+      <w:proofErr w:type="spellEnd"/>
+      <w:r>
+        <w:t xml:space="preserve"> mediante un link.</w:t>
+      </w:r>
+    </w:p>
+    <w:p>
+      <w:r>
+        <w:drawing>
+          <wp:inline distT="0" distB="0" distL="0" distR="0" wp14:anchorId="4A22607C" wp14:editId="194B9CDA">
+            <wp:extent cx="5400040" cy="113030"/>
+            <wp:effectExtent l="0" t="0" r="0" b="1270"/>
+            <wp:docPr id="240927225" name="Imagen 1"/>
+            <wp:cNvGraphicFramePr>
+              <a:graphicFrameLocks xmlns:a="http://schemas.openxmlformats.org/drawingml/2006/main" noChangeAspect="1"/>
+            </wp:cNvGraphicFramePr>
+            <a:graphic xmlns:a="http://schemas.openxmlformats.org/drawingml/2006/main">
+              <a:graphicData uri="http://schemas.openxmlformats.org/drawingml/2006/picture">
+                <pic:pic xmlns:pic="http://schemas.openxmlformats.org/drawingml/2006/picture">
+                  <pic:nvPicPr>
+                    <pic:cNvPr id="240927225" name=""/>
+                    <pic:cNvPicPr/>
+                  </pic:nvPicPr>
+                  <pic:blipFill>
+                    <a:blip r:embed="rId20"/>
+                    <a:stretch>
+                      <a:fillRect/>
+                    </a:stretch>
+                  </pic:blipFill>
+                  <pic:spPr>
+                    <a:xfrm>
+                      <a:off x="0" y="0"/>
+                      <a:ext cx="5400040" cy="113030"/>
+                    </a:xfrm>
+                    <a:prstGeom prst="rect">
+                      <a:avLst/>
+                    </a:prstGeom>
+                  </pic:spPr>
+                </pic:pic>
+              </a:graphicData>
+            </a:graphic>
+          </wp:inline>
+        </w:drawing>
+      </w:r>
+    </w:p>
+    <w:p>
+      <w:r>
+        <w:t xml:space="preserve">En la creación del </w:t>
+      </w:r>
+      <w:proofErr w:type="spellStart"/>
+      <w:r>
+        <w:t>rss</w:t>
+      </w:r>
+      <w:proofErr w:type="spellEnd"/>
+      <w:r>
+        <w:t xml:space="preserve"> se </w:t>
+      </w:r>
+    </w:p>
     <w:p/>
     <w:p/>
     <w:sectPr>

</xml_diff>

<commit_message>
Arreglo de errores en proximos eventos, cambios en sobre nosotros y un error en java
</commit_message>
<xml_diff>
--- a/proyecto_informe.docx
+++ b/proyecto_informe.docx
@@ -8,8 +8,13 @@
       </w:r>
     </w:p>
     <w:p>
-      <w:r>
-        <w:t xml:space="preserve">Link de GIT: </w:t>
+      <w:proofErr w:type="gramStart"/>
+      <w:r>
+        <w:t>Link</w:t>
+      </w:r>
+      <w:proofErr w:type="gramEnd"/>
+      <w:r>
+        <w:t xml:space="preserve"> de GIT: </w:t>
       </w:r>
       <w:hyperlink r:id="rId5" w:history="1">
         <w:r>
@@ -25,6 +30,30 @@
     </w:p>
     <w:p>
       <w:r>
+        <w:t xml:space="preserve">-Diseño de la </w:t>
+      </w:r>
+      <w:proofErr w:type="gramStart"/>
+      <w:r>
+        <w:t>página :</w:t>
+      </w:r>
+      <w:proofErr w:type="gramEnd"/>
+      <w:r>
+        <w:t xml:space="preserve"> </w:t>
+      </w:r>
+      <w:hyperlink r:id="rId6" w:history="1">
+        <w:r>
+          <w:rPr>
+            <w:rStyle w:val="Hipervnculo"/>
+          </w:rPr>
+          <w:t>https://www.figma.com/proto/B98AxKuOVJ03kcHg7aNVUm/wireframe?node-id=0-1&amp;t=dw43iwZ1loDRSwek-1</w:t>
+        </w:r>
+      </w:hyperlink>
+      <w:r>
+        <w:t xml:space="preserve"> </w:t>
+      </w:r>
+    </w:p>
+    <w:p>
+      <w:r>
         <w:t>Día 23-3:</w:t>
       </w:r>
     </w:p>
@@ -52,7 +81,15 @@
       </w:r>
       <w:proofErr w:type="spellEnd"/>
       <w:r>
-        <w:t xml:space="preserve"> inspirado:  (poner q ha gustado que no)</w:t>
+        <w:t xml:space="preserve"> inspirado</w:t>
+      </w:r>
+      <w:proofErr w:type="gramStart"/>
+      <w:r>
+        <w:t>:  (</w:t>
+      </w:r>
+      <w:proofErr w:type="gramEnd"/>
+      <w:r>
+        <w:t>poner q ha gustado que no)</w:t>
       </w:r>
     </w:p>
     <w:p>
@@ -63,7 +100,7 @@
           <w:numId w:val="3"/>
         </w:numPr>
       </w:pPr>
-      <w:hyperlink r:id="rId6" w:history="1">
+      <w:hyperlink r:id="rId7" w:history="1">
         <w:r>
           <w:rPr>
             <w:rStyle w:val="Hipervnculo"/>
@@ -82,13 +119,19 @@
       <w:r>
         <w:t xml:space="preserve">Me ha gustado como </w:t>
       </w:r>
-      <w:proofErr w:type="spellStart"/>
-      <w:r>
-        <w:t>esta</w:t>
-      </w:r>
-      <w:proofErr w:type="spellEnd"/>
-      <w:r>
-        <w:t xml:space="preserve"> organizada la información excepto por lo que no me gusta que es la forma de organizar la información por días.</w:t>
+      <w:r>
+        <w:t>está</w:t>
+      </w:r>
+      <w:r>
+        <w:t xml:space="preserve"> organizada la información excepto por lo que no me gusta que </w:t>
+      </w:r>
+      <w:proofErr w:type="gramStart"/>
+      <w:r>
+        <w:t>es</w:t>
+      </w:r>
+      <w:proofErr w:type="gramEnd"/>
+      <w:r>
+        <w:t xml:space="preserve"> la forma de organizar la información por días.</w:t>
       </w:r>
     </w:p>
     <w:p>
@@ -99,7 +142,7 @@
           <w:numId w:val="2"/>
         </w:numPr>
       </w:pPr>
-      <w:hyperlink r:id="rId7" w:history="1">
+      <w:hyperlink r:id="rId8" w:history="1">
         <w:r>
           <w:rPr>
             <w:rStyle w:val="Hipervnculo"/>
@@ -123,42 +166,6 @@
       </w:r>
       <w:r>
         <w:t xml:space="preserve"> visual además de contar con un buscador al entrar a la web</w:t>
-      </w:r>
-    </w:p>
-    <w:p>
-      <w:pPr>
-        <w:pStyle w:val="Prrafodelista"/>
-        <w:numPr>
-          <w:ilvl w:val="0"/>
-          <w:numId w:val="1"/>
-        </w:numPr>
-      </w:pPr>
-      <w:hyperlink r:id="rId8" w:history="1">
-        <w:r>
-          <w:rPr>
-            <w:rStyle w:val="Hipervnculo"/>
-          </w:rPr>
-          <w:t>https://quefemos.com/</w:t>
-        </w:r>
-      </w:hyperlink>
-      <w:r>
-        <w:t xml:space="preserve"> </w:t>
-      </w:r>
-    </w:p>
-    <w:p>
-      <w:pPr>
-        <w:ind w:left="708"/>
-      </w:pPr>
-      <w:r>
-        <w:t xml:space="preserve">Me gusta que la información </w:t>
-      </w:r>
-      <w:proofErr w:type="spellStart"/>
-      <w:r>
-        <w:t>este</w:t>
-      </w:r>
-      <w:proofErr w:type="spellEnd"/>
-      <w:r>
-        <w:t xml:space="preserve"> dispuesta de forma visual pero no me gusta que algunas imágenes salen deformadas</w:t>
       </w:r>
     </w:p>
     <w:p>
@@ -174,6 +181,40 @@
           <w:rPr>
             <w:rStyle w:val="Hipervnculo"/>
           </w:rPr>
+          <w:t>https://quefemos.com/</w:t>
+        </w:r>
+      </w:hyperlink>
+      <w:r>
+        <w:t xml:space="preserve"> </w:t>
+      </w:r>
+    </w:p>
+    <w:p>
+      <w:pPr>
+        <w:ind w:left="708"/>
+      </w:pPr>
+      <w:r>
+        <w:t xml:space="preserve">Me gusta que la información </w:t>
+      </w:r>
+      <w:r>
+        <w:t>esté</w:t>
+      </w:r>
+      <w:r>
+        <w:t xml:space="preserve"> dispuesta de forma visual pero no me gusta que algunas imágenes salen deformadas</w:t>
+      </w:r>
+    </w:p>
+    <w:p>
+      <w:pPr>
+        <w:pStyle w:val="Prrafodelista"/>
+        <w:numPr>
+          <w:ilvl w:val="0"/>
+          <w:numId w:val="1"/>
+        </w:numPr>
+      </w:pPr>
+      <w:hyperlink r:id="rId10" w:history="1">
+        <w:r>
+          <w:rPr>
+            <w:rStyle w:val="Hipervnculo"/>
+          </w:rPr>
           <w:t>https://www.turismoasturias.es/es/agenda-de-asturias</w:t>
         </w:r>
       </w:hyperlink>
@@ -193,15 +234,49 @@
     </w:p>
     <w:p>
       <w:r>
-        <w:rPr>
-          <w:noProof/>
-        </w:rPr>
-        <w:lastRenderedPageBreak/>
+        <w:t xml:space="preserve">En esta fase del proyecto se elabora la parte del </w:t>
+      </w:r>
+      <w:proofErr w:type="spellStart"/>
+      <w:r>
+        <w:t>wireframe</w:t>
+      </w:r>
+      <w:proofErr w:type="spellEnd"/>
+      <w:r>
+        <w:t xml:space="preserve"> para las </w:t>
+      </w:r>
+      <w:r>
+        <w:t>páginas</w:t>
+      </w:r>
+      <w:r>
+        <w:t xml:space="preserve"> de inicio próximos eventos y contacto</w:t>
+      </w:r>
+      <w:r>
+        <w:t xml:space="preserve">, este es el </w:t>
+      </w:r>
+      <w:proofErr w:type="spellStart"/>
+      <w:r>
+        <w:t>wireframe</w:t>
+      </w:r>
+      <w:proofErr w:type="spellEnd"/>
+      <w:r>
+        <w:t xml:space="preserve"> de la </w:t>
+      </w:r>
+      <w:proofErr w:type="spellStart"/>
+      <w:r>
+        <w:t>pagina</w:t>
+      </w:r>
+      <w:proofErr w:type="spellEnd"/>
+      <w:r>
+        <w:t xml:space="preserve"> de inicio.</w:t>
+      </w:r>
+    </w:p>
+    <w:p>
+      <w:r>
         <w:drawing>
-          <wp:inline distT="0" distB="0" distL="0" distR="0" wp14:anchorId="5AAEDB86" wp14:editId="01288B3C">
-            <wp:extent cx="3880819" cy="4183380"/>
-            <wp:effectExtent l="0" t="0" r="5715" b="7620"/>
-            <wp:docPr id="1950235941" name="Imagen 1" descr="Diagrama&#10;&#10;El contenido generado por IA puede ser incorrecto."/>
+          <wp:inline distT="0" distB="0" distL="0" distR="0" wp14:anchorId="30E1DD6A" wp14:editId="18553D95">
+            <wp:extent cx="2082800" cy="2365350"/>
+            <wp:effectExtent l="0" t="0" r="0" b="0"/>
+            <wp:docPr id="183699886" name="Imagen 1"/>
             <wp:cNvGraphicFramePr>
               <a:graphicFrameLocks xmlns:a="http://schemas.openxmlformats.org/drawingml/2006/main" noChangeAspect="1"/>
             </wp:cNvGraphicFramePr>
@@ -209,11 +284,17 @@
               <a:graphicData uri="http://schemas.openxmlformats.org/drawingml/2006/picture">
                 <pic:pic xmlns:pic="http://schemas.openxmlformats.org/drawingml/2006/picture">
                   <pic:nvPicPr>
-                    <pic:cNvPr id="1950235941" name="Imagen 1" descr="Diagrama&#10;&#10;El contenido generado por IA puede ser incorrecto."/>
+                    <pic:cNvPr id="183699886" name=""/>
                     <pic:cNvPicPr/>
                   </pic:nvPicPr>
                   <pic:blipFill>
-                    <a:blip r:embed="rId10"/>
+                    <a:blip r:embed="rId11" cstate="print">
+                      <a:extLst>
+                        <a:ext uri="{28A0092B-C50C-407E-A947-70E740481C1C}">
+                          <a14:useLocalDpi xmlns:a14="http://schemas.microsoft.com/office/drawing/2010/main" val="0"/>
+                        </a:ext>
+                      </a:extLst>
+                    </a:blip>
                     <a:stretch>
                       <a:fillRect/>
                     </a:stretch>
@@ -221,7 +302,7 @@
                   <pic:spPr>
                     <a:xfrm>
                       <a:off x="0" y="0"/>
-                      <a:ext cx="3889747" cy="4193004"/>
+                      <a:ext cx="2082800" cy="2365350"/>
                     </a:xfrm>
                     <a:prstGeom prst="rect">
                       <a:avLst/>
@@ -236,14 +317,25 @@
     </w:p>
     <w:p>
       <w:r>
-        <w:rPr>
-          <w:noProof/>
-        </w:rPr>
+        <w:lastRenderedPageBreak/>
+        <w:t xml:space="preserve">Y esta la versión con los colores que se le </w:t>
+      </w:r>
+      <w:proofErr w:type="gramStart"/>
+      <w:r>
+        <w:t>va</w:t>
+      </w:r>
+      <w:proofErr w:type="gramEnd"/>
+      <w:r>
+        <w:t xml:space="preserve"> dar:</w:t>
+      </w:r>
+    </w:p>
+    <w:p>
+      <w:r>
         <w:drawing>
-          <wp:inline distT="0" distB="0" distL="0" distR="0" wp14:anchorId="0B723153" wp14:editId="36DAFD4B">
-            <wp:extent cx="3909060" cy="4379764"/>
-            <wp:effectExtent l="0" t="0" r="0" b="1905"/>
-            <wp:docPr id="142612324" name="Imagen 1" descr="Imagen que contiene Aplicación&#10;&#10;El contenido generado por IA puede ser incorrecto."/>
+          <wp:inline distT="0" distB="0" distL="0" distR="0" wp14:anchorId="4DCB94FA" wp14:editId="620A6FC3">
+            <wp:extent cx="3054061" cy="3708400"/>
+            <wp:effectExtent l="0" t="0" r="0" b="6350"/>
+            <wp:docPr id="1179003377" name="Imagen 1"/>
             <wp:cNvGraphicFramePr>
               <a:graphicFrameLocks xmlns:a="http://schemas.openxmlformats.org/drawingml/2006/main" noChangeAspect="1"/>
             </wp:cNvGraphicFramePr>
@@ -251,50 +343,7 @@
               <a:graphicData uri="http://schemas.openxmlformats.org/drawingml/2006/picture">
                 <pic:pic xmlns:pic="http://schemas.openxmlformats.org/drawingml/2006/picture">
                   <pic:nvPicPr>
-                    <pic:cNvPr id="142612324" name="Imagen 1" descr="Imagen que contiene Aplicación&#10;&#10;El contenido generado por IA puede ser incorrecto."/>
-                    <pic:cNvPicPr/>
-                  </pic:nvPicPr>
-                  <pic:blipFill>
-                    <a:blip r:embed="rId11"/>
-                    <a:stretch>
-                      <a:fillRect/>
-                    </a:stretch>
-                  </pic:blipFill>
-                  <pic:spPr>
-                    <a:xfrm>
-                      <a:off x="0" y="0"/>
-                      <a:ext cx="3919486" cy="4391445"/>
-                    </a:xfrm>
-                    <a:prstGeom prst="rect">
-                      <a:avLst/>
-                    </a:prstGeom>
-                  </pic:spPr>
-                </pic:pic>
-              </a:graphicData>
-            </a:graphic>
-          </wp:inline>
-        </w:drawing>
-      </w:r>
-    </w:p>
-    <w:p>
-      <w:r>
-        <w:rPr>
-          <w:noProof/>
-        </w:rPr>
-        <w:lastRenderedPageBreak/>
-        <w:drawing>
-          <wp:inline distT="0" distB="0" distL="0" distR="0" wp14:anchorId="2C093F69" wp14:editId="79D277B5">
-            <wp:extent cx="3804284" cy="4163060"/>
-            <wp:effectExtent l="0" t="0" r="6350" b="0"/>
-            <wp:docPr id="182762564" name="Imagen 1" descr="Interfaz de usuario gráfica, Sitio web&#10;&#10;El contenido generado por IA puede ser incorrecto."/>
-            <wp:cNvGraphicFramePr>
-              <a:graphicFrameLocks xmlns:a="http://schemas.openxmlformats.org/drawingml/2006/main" noChangeAspect="1"/>
-            </wp:cNvGraphicFramePr>
-            <a:graphic xmlns:a="http://schemas.openxmlformats.org/drawingml/2006/main">
-              <a:graphicData uri="http://schemas.openxmlformats.org/drawingml/2006/picture">
-                <pic:pic xmlns:pic="http://schemas.openxmlformats.org/drawingml/2006/picture">
-                  <pic:nvPicPr>
-                    <pic:cNvPr id="182762564" name="Imagen 1" descr="Interfaz de usuario gráfica, Sitio web&#10;&#10;El contenido generado por IA puede ser incorrecto."/>
+                    <pic:cNvPr id="1179003377" name=""/>
                     <pic:cNvPicPr/>
                   </pic:nvPicPr>
                   <pic:blipFill>
@@ -306,7 +355,7 @@
                   <pic:spPr>
                     <a:xfrm>
                       <a:off x="0" y="0"/>
-                      <a:ext cx="3818476" cy="4178591"/>
+                      <a:ext cx="3058520" cy="3713814"/>
                     </a:xfrm>
                     <a:prstGeom prst="rect">
                       <a:avLst/>
@@ -321,35 +370,307 @@
     </w:p>
     <w:p>
       <w:r>
-        <w:t xml:space="preserve">No </w:t>
+        <w:t xml:space="preserve">Este es el </w:t>
       </w:r>
       <w:proofErr w:type="spellStart"/>
       <w:r>
-        <w:t>esta</w:t>
+        <w:t>wireframe</w:t>
       </w:r>
       <w:proofErr w:type="spellEnd"/>
       <w:r>
-        <w:t xml:space="preserve"> completa y hace falta hacer cambios aun</w:t>
+        <w:t xml:space="preserve"> de la </w:t>
+      </w:r>
+      <w:proofErr w:type="spellStart"/>
+      <w:r>
+        <w:t>pagina</w:t>
+      </w:r>
+      <w:proofErr w:type="spellEnd"/>
+      <w:r>
+        <w:t xml:space="preserve"> de próximos eventos que es bastante similar.</w:t>
+      </w:r>
+    </w:p>
+    <w:p>
+      <w:r>
+        <w:drawing>
+          <wp:inline distT="0" distB="0" distL="0" distR="0" wp14:anchorId="54958D5B" wp14:editId="5124C78C">
+            <wp:extent cx="3279265" cy="3778250"/>
+            <wp:effectExtent l="0" t="0" r="0" b="0"/>
+            <wp:docPr id="87113004" name="Imagen 1"/>
+            <wp:cNvGraphicFramePr>
+              <a:graphicFrameLocks xmlns:a="http://schemas.openxmlformats.org/drawingml/2006/main" noChangeAspect="1"/>
+            </wp:cNvGraphicFramePr>
+            <a:graphic xmlns:a="http://schemas.openxmlformats.org/drawingml/2006/main">
+              <a:graphicData uri="http://schemas.openxmlformats.org/drawingml/2006/picture">
+                <pic:pic xmlns:pic="http://schemas.openxmlformats.org/drawingml/2006/picture">
+                  <pic:nvPicPr>
+                    <pic:cNvPr id="87113004" name=""/>
+                    <pic:cNvPicPr/>
+                  </pic:nvPicPr>
+                  <pic:blipFill>
+                    <a:blip r:embed="rId13"/>
+                    <a:stretch>
+                      <a:fillRect/>
+                    </a:stretch>
+                  </pic:blipFill>
+                  <pic:spPr>
+                    <a:xfrm>
+                      <a:off x="0" y="0"/>
+                      <a:ext cx="3289180" cy="3789674"/>
+                    </a:xfrm>
+                    <a:prstGeom prst="rect">
+                      <a:avLst/>
+                    </a:prstGeom>
+                  </pic:spPr>
+                </pic:pic>
+              </a:graphicData>
+            </a:graphic>
+          </wp:inline>
+        </w:drawing>
       </w:r>
     </w:p>
     <w:p/>
-    <w:p>
-      <w:r>
-        <w:t>-</w:t>
-      </w:r>
-      <w:r>
-        <w:t>Esquema</w:t>
-      </w:r>
-      <w:r>
-        <w:t xml:space="preserve"> de </w:t>
+    <w:p/>
+    <w:p>
+      <w:r>
+        <w:lastRenderedPageBreak/>
+        <w:t>Y la versión con color.</w:t>
+      </w:r>
+    </w:p>
+    <w:p>
+      <w:r>
+        <w:drawing>
+          <wp:inline distT="0" distB="0" distL="0" distR="0" wp14:anchorId="75F2AFE5" wp14:editId="6694EA81">
+            <wp:extent cx="3285871" cy="3759200"/>
+            <wp:effectExtent l="0" t="0" r="0" b="0"/>
+            <wp:docPr id="595598865" name="Imagen 1"/>
+            <wp:cNvGraphicFramePr>
+              <a:graphicFrameLocks xmlns:a="http://schemas.openxmlformats.org/drawingml/2006/main" noChangeAspect="1"/>
+            </wp:cNvGraphicFramePr>
+            <a:graphic xmlns:a="http://schemas.openxmlformats.org/drawingml/2006/main">
+              <a:graphicData uri="http://schemas.openxmlformats.org/drawingml/2006/picture">
+                <pic:pic xmlns:pic="http://schemas.openxmlformats.org/drawingml/2006/picture">
+                  <pic:nvPicPr>
+                    <pic:cNvPr id="595598865" name=""/>
+                    <pic:cNvPicPr/>
+                  </pic:nvPicPr>
+                  <pic:blipFill>
+                    <a:blip r:embed="rId14"/>
+                    <a:stretch>
+                      <a:fillRect/>
+                    </a:stretch>
+                  </pic:blipFill>
+                  <pic:spPr>
+                    <a:xfrm>
+                      <a:off x="0" y="0"/>
+                      <a:ext cx="3291366" cy="3765486"/>
+                    </a:xfrm>
+                    <a:prstGeom prst="rect">
+                      <a:avLst/>
+                    </a:prstGeom>
+                  </pic:spPr>
+                </pic:pic>
+              </a:graphicData>
+            </a:graphic>
+          </wp:inline>
+        </w:drawing>
+      </w:r>
+    </w:p>
+    <w:p>
+      <w:r>
+        <w:t>Y este es el de la página contactos.</w:t>
+      </w:r>
+    </w:p>
+    <w:p>
+      <w:r>
+        <w:drawing>
+          <wp:inline distT="0" distB="0" distL="0" distR="0" wp14:anchorId="231D5487" wp14:editId="1516081B">
+            <wp:extent cx="3503254" cy="3892550"/>
+            <wp:effectExtent l="0" t="0" r="2540" b="0"/>
+            <wp:docPr id="2034966130" name="Imagen 1"/>
+            <wp:cNvGraphicFramePr>
+              <a:graphicFrameLocks xmlns:a="http://schemas.openxmlformats.org/drawingml/2006/main" noChangeAspect="1"/>
+            </wp:cNvGraphicFramePr>
+            <a:graphic xmlns:a="http://schemas.openxmlformats.org/drawingml/2006/main">
+              <a:graphicData uri="http://schemas.openxmlformats.org/drawingml/2006/picture">
+                <pic:pic xmlns:pic="http://schemas.openxmlformats.org/drawingml/2006/picture">
+                  <pic:nvPicPr>
+                    <pic:cNvPr id="2034966130" name=""/>
+                    <pic:cNvPicPr/>
+                  </pic:nvPicPr>
+                  <pic:blipFill>
+                    <a:blip r:embed="rId15"/>
+                    <a:stretch>
+                      <a:fillRect/>
+                    </a:stretch>
+                  </pic:blipFill>
+                  <pic:spPr>
+                    <a:xfrm>
+                      <a:off x="0" y="0"/>
+                      <a:ext cx="3541880" cy="3935468"/>
+                    </a:xfrm>
+                    <a:prstGeom prst="rect">
+                      <a:avLst/>
+                    </a:prstGeom>
+                  </pic:spPr>
+                </pic:pic>
+              </a:graphicData>
+            </a:graphic>
+          </wp:inline>
+        </w:drawing>
+      </w:r>
+    </w:p>
+    <w:p/>
+    <w:p>
+      <w:r>
+        <w:lastRenderedPageBreak/>
+        <w:t>Y esta es la versión con los colores</w:t>
+      </w:r>
+      <w:r>
+        <w:t xml:space="preserve"> del de contactos.</w:t>
+      </w:r>
+    </w:p>
+    <w:p>
+      <w:r>
+        <w:drawing>
+          <wp:inline distT="0" distB="0" distL="0" distR="0" wp14:anchorId="359F2C49" wp14:editId="4616613A">
+            <wp:extent cx="3371850" cy="3744959"/>
+            <wp:effectExtent l="0" t="0" r="0" b="8255"/>
+            <wp:docPr id="721781122" name="Imagen 1"/>
+            <wp:cNvGraphicFramePr>
+              <a:graphicFrameLocks xmlns:a="http://schemas.openxmlformats.org/drawingml/2006/main" noChangeAspect="1"/>
+            </wp:cNvGraphicFramePr>
+            <a:graphic xmlns:a="http://schemas.openxmlformats.org/drawingml/2006/main">
+              <a:graphicData uri="http://schemas.openxmlformats.org/drawingml/2006/picture">
+                <pic:pic xmlns:pic="http://schemas.openxmlformats.org/drawingml/2006/picture">
+                  <pic:nvPicPr>
+                    <pic:cNvPr id="721781122" name=""/>
+                    <pic:cNvPicPr/>
+                  </pic:nvPicPr>
+                  <pic:blipFill>
+                    <a:blip r:embed="rId16"/>
+                    <a:stretch>
+                      <a:fillRect/>
+                    </a:stretch>
+                  </pic:blipFill>
+                  <pic:spPr>
+                    <a:xfrm>
+                      <a:off x="0" y="0"/>
+                      <a:ext cx="3380951" cy="3755067"/>
+                    </a:xfrm>
+                    <a:prstGeom prst="rect">
+                      <a:avLst/>
+                    </a:prstGeom>
+                  </pic:spPr>
+                </pic:pic>
+              </a:graphicData>
+            </a:graphic>
+          </wp:inline>
+        </w:drawing>
+      </w:r>
+    </w:p>
+    <w:p>
+      <w:r>
+        <w:t xml:space="preserve">Y las versiones finales el mockup de las tres </w:t>
       </w:r>
       <w:proofErr w:type="spellStart"/>
       <w:r>
-        <w:t>como</w:t>
+        <w:t>paginas</w:t>
       </w:r>
       <w:proofErr w:type="spellEnd"/>
       <w:r>
-        <w:t xml:space="preserve"> se va a ver la </w:t>
+        <w:t>, el mockup de inicio</w:t>
+      </w:r>
+    </w:p>
+    <w:p>
+      <w:r>
+        <w:drawing>
+          <wp:inline distT="0" distB="0" distL="0" distR="0" wp14:anchorId="3792CE04" wp14:editId="46F4BD1A">
+            <wp:extent cx="3327400" cy="4316543"/>
+            <wp:effectExtent l="0" t="0" r="6350" b="8255"/>
+            <wp:docPr id="308987637" name="Imagen 1"/>
+            <wp:cNvGraphicFramePr>
+              <a:graphicFrameLocks xmlns:a="http://schemas.openxmlformats.org/drawingml/2006/main" noChangeAspect="1"/>
+            </wp:cNvGraphicFramePr>
+            <a:graphic xmlns:a="http://schemas.openxmlformats.org/drawingml/2006/main">
+              <a:graphicData uri="http://schemas.openxmlformats.org/drawingml/2006/picture">
+                <pic:pic xmlns:pic="http://schemas.openxmlformats.org/drawingml/2006/picture">
+                  <pic:nvPicPr>
+                    <pic:cNvPr id="308987637" name=""/>
+                    <pic:cNvPicPr/>
+                  </pic:nvPicPr>
+                  <pic:blipFill>
+                    <a:blip r:embed="rId17"/>
+                    <a:stretch>
+                      <a:fillRect/>
+                    </a:stretch>
+                  </pic:blipFill>
+                  <pic:spPr>
+                    <a:xfrm>
+                      <a:off x="0" y="0"/>
+                      <a:ext cx="3348014" cy="4343285"/>
+                    </a:xfrm>
+                    <a:prstGeom prst="rect">
+                      <a:avLst/>
+                    </a:prstGeom>
+                  </pic:spPr>
+                </pic:pic>
+              </a:graphicData>
+            </a:graphic>
+          </wp:inline>
+        </w:drawing>
+      </w:r>
+      <w:r>
+        <w:t xml:space="preserve"> </w:t>
+      </w:r>
+    </w:p>
+    <w:p>
+      <w:r>
+        <w:lastRenderedPageBreak/>
+        <w:t>El mockup de la página de próximos eventos</w:t>
+      </w:r>
+    </w:p>
+    <w:p>
+      <w:r>
+        <w:drawing>
+          <wp:inline distT="0" distB="0" distL="0" distR="0" wp14:anchorId="7256EC1C" wp14:editId="29D06D18">
+            <wp:extent cx="3737607" cy="4140200"/>
+            <wp:effectExtent l="0" t="0" r="0" b="0"/>
+            <wp:docPr id="1839104285" name="Imagen 1"/>
+            <wp:cNvGraphicFramePr>
+              <a:graphicFrameLocks xmlns:a="http://schemas.openxmlformats.org/drawingml/2006/main" noChangeAspect="1"/>
+            </wp:cNvGraphicFramePr>
+            <a:graphic xmlns:a="http://schemas.openxmlformats.org/drawingml/2006/main">
+              <a:graphicData uri="http://schemas.openxmlformats.org/drawingml/2006/picture">
+                <pic:pic xmlns:pic="http://schemas.openxmlformats.org/drawingml/2006/picture">
+                  <pic:nvPicPr>
+                    <pic:cNvPr id="1839104285" name=""/>
+                    <pic:cNvPicPr/>
+                  </pic:nvPicPr>
+                  <pic:blipFill>
+                    <a:blip r:embed="rId18"/>
+                    <a:stretch>
+                      <a:fillRect/>
+                    </a:stretch>
+                  </pic:blipFill>
+                  <pic:spPr>
+                    <a:xfrm>
+                      <a:off x="0" y="0"/>
+                      <a:ext cx="3745500" cy="4148944"/>
+                    </a:xfrm>
+                    <a:prstGeom prst="rect">
+                      <a:avLst/>
+                    </a:prstGeom>
+                  </pic:spPr>
+                </pic:pic>
+              </a:graphicData>
+            </a:graphic>
+          </wp:inline>
+        </w:drawing>
+      </w:r>
+    </w:p>
+    <w:p>
+      <w:r>
+        <w:t xml:space="preserve">Y por ultimo el mockup de la </w:t>
       </w:r>
       <w:proofErr w:type="spellStart"/>
       <w:r>
@@ -357,23 +678,62 @@
       </w:r>
       <w:proofErr w:type="spellEnd"/>
       <w:r>
-        <w:t>(</w:t>
-      </w:r>
-      <w:proofErr w:type="spellStart"/>
-      <w:r>
-        <w:t>wireframe</w:t>
-      </w:r>
-      <w:proofErr w:type="spellEnd"/>
-      <w:r>
-        <w:t>)</w:t>
-      </w:r>
-      <w:r>
-        <w:t xml:space="preserve">: </w:t>
-      </w:r>
+        <w:t xml:space="preserve"> contacto</w:t>
+      </w:r>
+    </w:p>
+    <w:p>
+      <w:r>
+        <w:drawing>
+          <wp:inline distT="0" distB="0" distL="0" distR="0" wp14:anchorId="7151E813" wp14:editId="4B7CF1EB">
+            <wp:extent cx="3483529" cy="3873500"/>
+            <wp:effectExtent l="0" t="0" r="3175" b="0"/>
+            <wp:docPr id="1134103474" name="Imagen 1"/>
+            <wp:cNvGraphicFramePr>
+              <a:graphicFrameLocks xmlns:a="http://schemas.openxmlformats.org/drawingml/2006/main" noChangeAspect="1"/>
+            </wp:cNvGraphicFramePr>
+            <a:graphic xmlns:a="http://schemas.openxmlformats.org/drawingml/2006/main">
+              <a:graphicData uri="http://schemas.openxmlformats.org/drawingml/2006/picture">
+                <pic:pic xmlns:pic="http://schemas.openxmlformats.org/drawingml/2006/picture">
+                  <pic:nvPicPr>
+                    <pic:cNvPr id="1134103474" name=""/>
+                    <pic:cNvPicPr/>
+                  </pic:nvPicPr>
+                  <pic:blipFill>
+                    <a:blip r:embed="rId19"/>
+                    <a:stretch>
+                      <a:fillRect/>
+                    </a:stretch>
+                  </pic:blipFill>
+                  <pic:spPr>
+                    <a:xfrm>
+                      <a:off x="0" y="0"/>
+                      <a:ext cx="3498492" cy="3890138"/>
+                    </a:xfrm>
+                    <a:prstGeom prst="rect">
+                      <a:avLst/>
+                    </a:prstGeom>
+                  </pic:spPr>
+                </pic:pic>
+              </a:graphicData>
+            </a:graphic>
+          </wp:inline>
+        </w:drawing>
+      </w:r>
+    </w:p>
+    <w:p>
+      <w:r>
+        <w:lastRenderedPageBreak/>
+        <w:t xml:space="preserve">-Diseño de la </w:t>
+      </w:r>
+      <w:proofErr w:type="gramStart"/>
+      <w:r>
+        <w:t>página :</w:t>
+      </w:r>
+      <w:proofErr w:type="gramEnd"/>
       <w:r>
         <w:t xml:space="preserve"> </w:t>
       </w:r>
-      <w:hyperlink r:id="rId13" w:history="1">
+      <w:hyperlink r:id="rId20" w:history="1">
         <w:r>
           <w:rPr>
             <w:rStyle w:val="Hipervnculo"/>
@@ -392,12 +752,43 @@
     </w:p>
     <w:p>
       <w:r>
-        <w:t>Creación de las clases en java y el menú.</w:t>
+        <w:t>Hoy se comienza con la c</w:t>
+      </w:r>
+      <w:r>
+        <w:t>reación de las clases en java y el menú</w:t>
+      </w:r>
+      <w:r>
+        <w:t xml:space="preserve"> después de investigar </w:t>
+      </w:r>
+      <w:r>
+        <w:t>cómo</w:t>
+      </w:r>
+      <w:r>
+        <w:t xml:space="preserve"> utilizar el </w:t>
+      </w:r>
+      <w:proofErr w:type="spellStart"/>
+      <w:r>
+        <w:t>hashmap</w:t>
+      </w:r>
+      <w:proofErr w:type="spellEnd"/>
+      <w:r>
+        <w:t xml:space="preserve"> y el </w:t>
+      </w:r>
+      <w:proofErr w:type="spellStart"/>
+      <w:r>
+        <w:t>arraylist</w:t>
+      </w:r>
+      <w:proofErr w:type="spellEnd"/>
+      <w:r>
+        <w:t>.</w:t>
       </w:r>
     </w:p>
     <w:p>
       <w:r>
         <w:t>Como por ejemplo la clase eventos</w:t>
+      </w:r>
+      <w:r>
+        <w:t xml:space="preserve"> que se encarga de almacenar información relacionada a los eventos.</w:t>
       </w:r>
     </w:p>
     <w:p>
@@ -421,7 +812,7 @@
                     <pic:cNvPicPr/>
                   </pic:nvPicPr>
                   <pic:blipFill>
-                    <a:blip r:embed="rId14"/>
+                    <a:blip r:embed="rId21"/>
                     <a:stretch>
                       <a:fillRect/>
                     </a:stretch>
@@ -444,8 +835,174 @@
     </w:p>
     <w:p>
       <w:r>
+        <w:t xml:space="preserve">Esta es una muestra del código de la clase eventos en la cual no salen los </w:t>
+      </w:r>
+      <w:proofErr w:type="spellStart"/>
+      <w:r>
+        <w:t>getter</w:t>
+      </w:r>
+      <w:proofErr w:type="spellEnd"/>
+      <w:r>
+        <w:t xml:space="preserve"> y setter.</w:t>
+      </w:r>
+    </w:p>
+    <w:p>
+      <w:r>
+        <w:t xml:space="preserve">La primera parte conformada por </w:t>
+      </w:r>
+      <w:proofErr w:type="spellStart"/>
+      <w:r>
+        <w:t>private</w:t>
+      </w:r>
+      <w:proofErr w:type="spellEnd"/>
+      <w:r>
+        <w:t xml:space="preserve"> String o </w:t>
+      </w:r>
+      <w:proofErr w:type="spellStart"/>
+      <w:r>
+        <w:t>hashmap</w:t>
+      </w:r>
+      <w:proofErr w:type="spellEnd"/>
+      <w:r>
+        <w:t xml:space="preserve"> y un nombre es donde se declaran los atributos</w:t>
+      </w:r>
+      <w:r>
+        <w:t xml:space="preserve">, para posteriormente el resto del código mostrado que recibe como parámetros todos los datos y los asigna a los atributos e inicializa el </w:t>
+      </w:r>
+      <w:proofErr w:type="spellStart"/>
+      <w:r>
+        <w:t>hashmap</w:t>
+      </w:r>
+      <w:proofErr w:type="spellEnd"/>
+      <w:r>
+        <w:t>.</w:t>
+      </w:r>
+    </w:p>
+    <w:p>
+      <w:r>
+        <w:t xml:space="preserve">Y por </w:t>
+      </w:r>
+      <w:proofErr w:type="spellStart"/>
+      <w:r>
+        <w:t>ultimo</w:t>
+      </w:r>
+      <w:proofErr w:type="spellEnd"/>
+      <w:r>
+        <w:t xml:space="preserve"> el método </w:t>
+      </w:r>
+      <w:proofErr w:type="spellStart"/>
+      <w:r>
+        <w:t>toString</w:t>
+      </w:r>
+      <w:proofErr w:type="spellEnd"/>
+      <w:r>
+        <w:t xml:space="preserve"> que muestra la información de los eventos añadidos anteriormente</w:t>
+      </w:r>
+      <w:r>
+        <w:drawing>
+          <wp:inline distT="0" distB="0" distL="0" distR="0" wp14:anchorId="48121096" wp14:editId="2D6B9E26">
+            <wp:extent cx="5400040" cy="520065"/>
+            <wp:effectExtent l="0" t="0" r="0" b="0"/>
+            <wp:docPr id="1446311275" name="Imagen 1"/>
+            <wp:cNvGraphicFramePr>
+              <a:graphicFrameLocks xmlns:a="http://schemas.openxmlformats.org/drawingml/2006/main" noChangeAspect="1"/>
+            </wp:cNvGraphicFramePr>
+            <a:graphic xmlns:a="http://schemas.openxmlformats.org/drawingml/2006/main">
+              <a:graphicData uri="http://schemas.openxmlformats.org/drawingml/2006/picture">
+                <pic:pic xmlns:pic="http://schemas.openxmlformats.org/drawingml/2006/picture">
+                  <pic:nvPicPr>
+                    <pic:cNvPr id="1446311275" name=""/>
+                    <pic:cNvPicPr/>
+                  </pic:nvPicPr>
+                  <pic:blipFill>
+                    <a:blip r:embed="rId22"/>
+                    <a:stretch>
+                      <a:fillRect/>
+                    </a:stretch>
+                  </pic:blipFill>
+                  <pic:spPr>
+                    <a:xfrm>
+                      <a:off x="0" y="0"/>
+                      <a:ext cx="5400040" cy="520065"/>
+                    </a:xfrm>
+                    <a:prstGeom prst="rect">
+                      <a:avLst/>
+                    </a:prstGeom>
+                  </pic:spPr>
+                </pic:pic>
+              </a:graphicData>
+            </a:graphic>
+          </wp:inline>
+        </w:drawing>
+      </w:r>
+    </w:p>
+    <w:p>
+      <w:r>
+        <w:t>La clase favorito funciona de una forma similar solo que recolecta los datos de los eventos favoritos y los devuelve.</w:t>
+      </w:r>
+    </w:p>
+    <w:p>
+      <w:r>
         <w:lastRenderedPageBreak/>
-        <w:t xml:space="preserve">Esta es una muestra del código de la clase eventos en la cual no salen los </w:t>
+        <w:drawing>
+          <wp:inline distT="0" distB="0" distL="0" distR="0" wp14:anchorId="58C54D39" wp14:editId="60BBEE14">
+            <wp:extent cx="5400040" cy="4331335"/>
+            <wp:effectExtent l="0" t="0" r="0" b="0"/>
+            <wp:docPr id="862972135" name="Imagen 1"/>
+            <wp:cNvGraphicFramePr>
+              <a:graphicFrameLocks xmlns:a="http://schemas.openxmlformats.org/drawingml/2006/main" noChangeAspect="1"/>
+            </wp:cNvGraphicFramePr>
+            <a:graphic xmlns:a="http://schemas.openxmlformats.org/drawingml/2006/main">
+              <a:graphicData uri="http://schemas.openxmlformats.org/drawingml/2006/picture">
+                <pic:pic xmlns:pic="http://schemas.openxmlformats.org/drawingml/2006/picture">
+                  <pic:nvPicPr>
+                    <pic:cNvPr id="862972135" name=""/>
+                    <pic:cNvPicPr/>
+                  </pic:nvPicPr>
+                  <pic:blipFill>
+                    <a:blip r:embed="rId23"/>
+                    <a:stretch>
+                      <a:fillRect/>
+                    </a:stretch>
+                  </pic:blipFill>
+                  <pic:spPr>
+                    <a:xfrm>
+                      <a:off x="0" y="0"/>
+                      <a:ext cx="5400040" cy="4331335"/>
+                    </a:xfrm>
+                    <a:prstGeom prst="rect">
+                      <a:avLst/>
+                    </a:prstGeom>
+                  </pic:spPr>
+                </pic:pic>
+              </a:graphicData>
+            </a:graphic>
+          </wp:inline>
+        </w:drawing>
+      </w:r>
+    </w:p>
+    <w:p>
+      <w:r>
+        <w:t>La clase galería funci</w:t>
+      </w:r>
+      <w:r>
+        <w:t>ona</w:t>
+      </w:r>
+      <w:r>
+        <w:t xml:space="preserve"> </w:t>
+      </w:r>
+      <w:proofErr w:type="gramStart"/>
+      <w:r>
+        <w:t>igual</w:t>
+      </w:r>
+      <w:proofErr w:type="gramEnd"/>
+      <w:r>
+        <w:t xml:space="preserve"> pero con datos de las galerías.</w:t>
+      </w:r>
+    </w:p>
+    <w:p>
+      <w:r>
+        <w:t xml:space="preserve">En estas capturas no salen los </w:t>
       </w:r>
       <w:proofErr w:type="spellStart"/>
       <w:r>
@@ -453,18 +1010,204 @@
       </w:r>
       <w:proofErr w:type="spellEnd"/>
       <w:r>
-        <w:t xml:space="preserve"> y setter.</w:t>
-      </w:r>
-    </w:p>
-    <w:p>
-      <w:r>
-        <w:t xml:space="preserve">Se investiga como utilizar el </w:t>
+        <w:t xml:space="preserve"> ni los setter.</w:t>
+      </w:r>
+    </w:p>
+    <w:p>
+      <w:r>
+        <w:t xml:space="preserve">Se declaran los atributos y la parte siguiente mete la información como </w:t>
       </w:r>
       <w:proofErr w:type="spellStart"/>
       <w:r>
-        <w:t>Hashmap</w:t>
+        <w:t>parametros</w:t>
       </w:r>
       <w:proofErr w:type="spellEnd"/>
+      <w:r>
+        <w:t xml:space="preserve"> </w:t>
+      </w:r>
+      <w:r>
+        <w:t>y los asigna a los atributos del</w:t>
+      </w:r>
+      <w:r>
+        <w:t xml:space="preserve"> objeto</w:t>
+      </w:r>
+    </w:p>
+    <w:p>
+      <w:r>
+        <w:drawing>
+          <wp:inline distT="0" distB="0" distL="0" distR="0" wp14:anchorId="2791A8C9" wp14:editId="3296C71F">
+            <wp:extent cx="5400040" cy="2310765"/>
+            <wp:effectExtent l="0" t="0" r="0" b="0"/>
+            <wp:docPr id="2062749056" name="Imagen 1"/>
+            <wp:cNvGraphicFramePr>
+              <a:graphicFrameLocks xmlns:a="http://schemas.openxmlformats.org/drawingml/2006/main" noChangeAspect="1"/>
+            </wp:cNvGraphicFramePr>
+            <a:graphic xmlns:a="http://schemas.openxmlformats.org/drawingml/2006/main">
+              <a:graphicData uri="http://schemas.openxmlformats.org/drawingml/2006/picture">
+                <pic:pic xmlns:pic="http://schemas.openxmlformats.org/drawingml/2006/picture">
+                  <pic:nvPicPr>
+                    <pic:cNvPr id="2062749056" name=""/>
+                    <pic:cNvPicPr/>
+                  </pic:nvPicPr>
+                  <pic:blipFill>
+                    <a:blip r:embed="rId24"/>
+                    <a:stretch>
+                      <a:fillRect/>
+                    </a:stretch>
+                  </pic:blipFill>
+                  <pic:spPr>
+                    <a:xfrm>
+                      <a:off x="0" y="0"/>
+                      <a:ext cx="5400040" cy="2310765"/>
+                    </a:xfrm>
+                    <a:prstGeom prst="rect">
+                      <a:avLst/>
+                    </a:prstGeom>
+                  </pic:spPr>
+                </pic:pic>
+              </a:graphicData>
+            </a:graphic>
+          </wp:inline>
+        </w:drawing>
+      </w:r>
+    </w:p>
+    <w:p>
+      <w:r>
+        <w:t>Y esta es la parte que devuelve la información</w:t>
+      </w:r>
+    </w:p>
+    <w:p>
+      <w:r>
+        <w:lastRenderedPageBreak/>
+        <w:drawing>
+          <wp:inline distT="0" distB="0" distL="0" distR="0" wp14:anchorId="19CFF1E9" wp14:editId="3012B2BA">
+            <wp:extent cx="5400040" cy="718185"/>
+            <wp:effectExtent l="0" t="0" r="0" b="5715"/>
+            <wp:docPr id="2046338941" name="Imagen 1"/>
+            <wp:cNvGraphicFramePr>
+              <a:graphicFrameLocks xmlns:a="http://schemas.openxmlformats.org/drawingml/2006/main" noChangeAspect="1"/>
+            </wp:cNvGraphicFramePr>
+            <a:graphic xmlns:a="http://schemas.openxmlformats.org/drawingml/2006/main">
+              <a:graphicData uri="http://schemas.openxmlformats.org/drawingml/2006/picture">
+                <pic:pic xmlns:pic="http://schemas.openxmlformats.org/drawingml/2006/picture">
+                  <pic:nvPicPr>
+                    <pic:cNvPr id="2046338941" name=""/>
+                    <pic:cNvPicPr/>
+                  </pic:nvPicPr>
+                  <pic:blipFill>
+                    <a:blip r:embed="rId25"/>
+                    <a:stretch>
+                      <a:fillRect/>
+                    </a:stretch>
+                  </pic:blipFill>
+                  <pic:spPr>
+                    <a:xfrm>
+                      <a:off x="0" y="0"/>
+                      <a:ext cx="5400040" cy="718185"/>
+                    </a:xfrm>
+                    <a:prstGeom prst="rect">
+                      <a:avLst/>
+                    </a:prstGeom>
+                  </pic:spPr>
+                </pic:pic>
+              </a:graphicData>
+            </a:graphic>
+          </wp:inline>
+        </w:drawing>
+      </w:r>
+    </w:p>
+    <w:p>
+      <w:r>
+        <w:t>Y por ultimo la clase usuarios que funciona también de forma similar con la información de los usuarios</w:t>
+      </w:r>
+    </w:p>
+    <w:p>
+      <w:r>
+        <w:t>Esta es una muestra del código</w:t>
+      </w:r>
+    </w:p>
+    <w:p>
+      <w:r>
+        <w:drawing>
+          <wp:inline distT="0" distB="0" distL="0" distR="0" wp14:anchorId="021D9157" wp14:editId="5B50D032">
+            <wp:extent cx="5400040" cy="1721485"/>
+            <wp:effectExtent l="0" t="0" r="0" b="0"/>
+            <wp:docPr id="2110039313" name="Imagen 1"/>
+            <wp:cNvGraphicFramePr>
+              <a:graphicFrameLocks xmlns:a="http://schemas.openxmlformats.org/drawingml/2006/main" noChangeAspect="1"/>
+            </wp:cNvGraphicFramePr>
+            <a:graphic xmlns:a="http://schemas.openxmlformats.org/drawingml/2006/main">
+              <a:graphicData uri="http://schemas.openxmlformats.org/drawingml/2006/picture">
+                <pic:pic xmlns:pic="http://schemas.openxmlformats.org/drawingml/2006/picture">
+                  <pic:nvPicPr>
+                    <pic:cNvPr id="2110039313" name=""/>
+                    <pic:cNvPicPr/>
+                  </pic:nvPicPr>
+                  <pic:blipFill>
+                    <a:blip r:embed="rId26"/>
+                    <a:stretch>
+                      <a:fillRect/>
+                    </a:stretch>
+                  </pic:blipFill>
+                  <pic:spPr>
+                    <a:xfrm>
+                      <a:off x="0" y="0"/>
+                      <a:ext cx="5400040" cy="1721485"/>
+                    </a:xfrm>
+                    <a:prstGeom prst="rect">
+                      <a:avLst/>
+                    </a:prstGeom>
+                  </pic:spPr>
+                </pic:pic>
+              </a:graphicData>
+            </a:graphic>
+          </wp:inline>
+        </w:drawing>
+      </w:r>
+    </w:p>
+    <w:p>
+      <w:r>
+        <w:t>Y aquí la muestra del código que devuelve la información</w:t>
+      </w:r>
+    </w:p>
+    <w:p>
+      <w:r>
+        <w:drawing>
+          <wp:inline distT="0" distB="0" distL="0" distR="0" wp14:anchorId="49FB6C32" wp14:editId="0F1B8E95">
+            <wp:extent cx="5400040" cy="832485"/>
+            <wp:effectExtent l="0" t="0" r="0" b="5715"/>
+            <wp:docPr id="909961904" name="Imagen 1"/>
+            <wp:cNvGraphicFramePr>
+              <a:graphicFrameLocks xmlns:a="http://schemas.openxmlformats.org/drawingml/2006/main" noChangeAspect="1"/>
+            </wp:cNvGraphicFramePr>
+            <a:graphic xmlns:a="http://schemas.openxmlformats.org/drawingml/2006/main">
+              <a:graphicData uri="http://schemas.openxmlformats.org/drawingml/2006/picture">
+                <pic:pic xmlns:pic="http://schemas.openxmlformats.org/drawingml/2006/picture">
+                  <pic:nvPicPr>
+                    <pic:cNvPr id="909961904" name=""/>
+                    <pic:cNvPicPr/>
+                  </pic:nvPicPr>
+                  <pic:blipFill>
+                    <a:blip r:embed="rId27"/>
+                    <a:stretch>
+                      <a:fillRect/>
+                    </a:stretch>
+                  </pic:blipFill>
+                  <pic:spPr>
+                    <a:xfrm>
+                      <a:off x="0" y="0"/>
+                      <a:ext cx="5400040" cy="832485"/>
+                    </a:xfrm>
+                    <a:prstGeom prst="rect">
+                      <a:avLst/>
+                    </a:prstGeom>
+                  </pic:spPr>
+                </pic:pic>
+              </a:graphicData>
+            </a:graphic>
+          </wp:inline>
+        </w:drawing>
+      </w:r>
     </w:p>
     <w:p>
       <w:r>
@@ -503,7 +1246,7 @@
                     <pic:cNvPicPr/>
                   </pic:nvPicPr>
                   <pic:blipFill>
-                    <a:blip r:embed="rId15"/>
+                    <a:blip r:embed="rId28"/>
                     <a:stretch>
                       <a:fillRect/>
                     </a:stretch>
@@ -524,23 +1267,10 @@
         </w:drawing>
       </w:r>
     </w:p>
-    <w:p>
-      <w:r>
-        <w:t xml:space="preserve">Creación de </w:t>
-      </w:r>
-      <w:r>
-        <w:t>las tablas</w:t>
-      </w:r>
-      <w:r>
-        <w:t xml:space="preserve"> en base de datos</w:t>
-      </w:r>
-      <w:r>
-        <w:t xml:space="preserve"> y empiezan las vistas</w:t>
-      </w:r>
-    </w:p>
     <w:p/>
     <w:p>
       <w:r>
+        <w:lastRenderedPageBreak/>
         <w:t>Día 25-3:</w:t>
       </w:r>
     </w:p>
@@ -566,6 +1296,28 @@
     <w:p>
       <w:r>
         <w:t>Como esta tabla</w:t>
+      </w:r>
+      <w:r>
+        <w:t xml:space="preserve"> de usuarios que incluye el id, el nombre el email la contraseña y declara que la </w:t>
+      </w:r>
+      <w:proofErr w:type="spellStart"/>
+      <w:r>
+        <w:t>primary</w:t>
+      </w:r>
+      <w:proofErr w:type="spellEnd"/>
+      <w:r>
+        <w:t xml:space="preserve"> </w:t>
+      </w:r>
+      <w:proofErr w:type="spellStart"/>
+      <w:r>
+        <w:t>key</w:t>
+      </w:r>
+      <w:proofErr w:type="spellEnd"/>
+      <w:r>
+        <w:t xml:space="preserve"> es el id</w:t>
+      </w:r>
+      <w:r>
+        <w:t>.</w:t>
       </w:r>
     </w:p>
     <w:p>
@@ -574,9 +1326,9 @@
           <w:noProof/>
         </w:rPr>
         <w:drawing>
-          <wp:inline distT="0" distB="0" distL="0" distR="0" wp14:anchorId="31C0B1AD" wp14:editId="48542C2A">
-            <wp:extent cx="5400040" cy="1979295"/>
-            <wp:effectExtent l="0" t="0" r="0" b="1905"/>
+          <wp:inline distT="0" distB="0" distL="0" distR="0" wp14:anchorId="31C0B1AD" wp14:editId="6C74B2A7">
+            <wp:extent cx="4748641" cy="1570892"/>
+            <wp:effectExtent l="0" t="0" r="0" b="0"/>
             <wp:docPr id="39798933" name="Imagen 1"/>
             <wp:cNvGraphicFramePr>
               <a:graphicFrameLocks xmlns:a="http://schemas.openxmlformats.org/drawingml/2006/main" noChangeAspect="1"/>
@@ -588,20 +1340,29 @@
                     <pic:cNvPr id="39798933" name=""/>
                     <pic:cNvPicPr/>
                   </pic:nvPicPr>
-                  <pic:blipFill>
-                    <a:blip r:embed="rId16"/>
+                  <pic:blipFill rotWithShape="1">
+                    <a:blip r:embed="rId29"/>
+                    <a:srcRect b="9746"/>
                     <a:stretch>
                       <a:fillRect/>
                     </a:stretch>
                   </pic:blipFill>
-                  <pic:spPr>
+                  <pic:spPr bwMode="auto">
                     <a:xfrm>
                       <a:off x="0" y="0"/>
-                      <a:ext cx="5400040" cy="1979295"/>
+                      <a:ext cx="4754902" cy="1572963"/>
                     </a:xfrm>
                     <a:prstGeom prst="rect">
                       <a:avLst/>
                     </a:prstGeom>
+                    <a:ln>
+                      <a:noFill/>
+                    </a:ln>
+                    <a:extLst>
+                      <a:ext uri="{53640926-AAD7-44D8-BBD7-CCE9431645EC}">
+                        <a14:shadowObscured xmlns:a14="http://schemas.microsoft.com/office/drawing/2010/main"/>
+                      </a:ext>
+                    </a:extLst>
                   </pic:spPr>
                 </pic:pic>
               </a:graphicData>
@@ -614,17 +1375,19 @@
       <w:r>
         <w:t>O esta vista</w:t>
       </w:r>
+      <w:r>
+        <w:t xml:space="preserve"> que muestra el id y el titulo de las galerías de la tabla galerías en el que la fecha sea antes del 28-02-2026</w:t>
+      </w:r>
     </w:p>
     <w:p>
       <w:r>
         <w:rPr>
           <w:noProof/>
         </w:rPr>
-        <w:lastRenderedPageBreak/>
         <w:drawing>
-          <wp:inline distT="0" distB="0" distL="0" distR="0" wp14:anchorId="69110333" wp14:editId="13A09E44">
-            <wp:extent cx="5400040" cy="1788795"/>
-            <wp:effectExtent l="0" t="0" r="0" b="1905"/>
+          <wp:inline distT="0" distB="0" distL="0" distR="0" wp14:anchorId="69110333" wp14:editId="1BD984A6">
+            <wp:extent cx="4706581" cy="1283677"/>
+            <wp:effectExtent l="0" t="0" r="0" b="0"/>
             <wp:docPr id="2111991726" name="Imagen 1"/>
             <wp:cNvGraphicFramePr>
               <a:graphicFrameLocks xmlns:a="http://schemas.openxmlformats.org/drawingml/2006/main" noChangeAspect="1"/>
@@ -636,20 +1399,29 @@
                     <pic:cNvPr id="2111991726" name=""/>
                     <pic:cNvPicPr/>
                   </pic:nvPicPr>
-                  <pic:blipFill>
-                    <a:blip r:embed="rId17"/>
+                  <pic:blipFill rotWithShape="1">
+                    <a:blip r:embed="rId30"/>
+                    <a:srcRect t="8644" b="9020"/>
                     <a:stretch>
                       <a:fillRect/>
                     </a:stretch>
                   </pic:blipFill>
-                  <pic:spPr>
+                  <pic:spPr bwMode="auto">
                     <a:xfrm>
                       <a:off x="0" y="0"/>
-                      <a:ext cx="5400040" cy="1788795"/>
+                      <a:ext cx="4719012" cy="1287068"/>
                     </a:xfrm>
                     <a:prstGeom prst="rect">
                       <a:avLst/>
                     </a:prstGeom>
+                    <a:ln>
+                      <a:noFill/>
+                    </a:ln>
+                    <a:extLst>
+                      <a:ext uri="{53640926-AAD7-44D8-BBD7-CCE9431645EC}">
+                        <a14:shadowObscured xmlns:a14="http://schemas.microsoft.com/office/drawing/2010/main"/>
+                      </a:ext>
+                    </a:extLst>
                   </pic:spPr>
                 </pic:pic>
               </a:graphicData>
@@ -660,31 +1432,49 @@
     </w:p>
     <w:p>
       <w:r>
+        <w:t xml:space="preserve">La vista aun no funciona por lo que se mostrara como funciona mas adelante, no funciona por que aun no se ha hecho la implementación de </w:t>
+      </w:r>
+      <w:proofErr w:type="gramStart"/>
+      <w:r>
+        <w:t>datos .</w:t>
+      </w:r>
+      <w:proofErr w:type="gramEnd"/>
+    </w:p>
+    <w:p/>
+    <w:p>
+      <w:r>
         <w:t>Día 26-3:</w:t>
       </w:r>
     </w:p>
     <w:p>
       <w:r>
-        <w:t>Se continua con la inserción de datos, solucionar algunos fallos en la base de datos y arreglar las vistas</w:t>
-      </w:r>
-      <w:r>
-        <w:t xml:space="preserve">, funciona todo excepto por que con el </w:t>
-      </w:r>
-      <w:proofErr w:type="spellStart"/>
-      <w:r>
-        <w:t>user</w:t>
-      </w:r>
-      <w:proofErr w:type="spellEnd"/>
-      <w:r>
-        <w:t xml:space="preserve"> proyecto no deja tiene que ser con el </w:t>
-      </w:r>
-      <w:proofErr w:type="spellStart"/>
-      <w:r>
-        <w:t>admin</w:t>
-      </w:r>
-      <w:proofErr w:type="spellEnd"/>
-      <w:r>
-        <w:t>.</w:t>
+        <w:t xml:space="preserve">Se </w:t>
+      </w:r>
+      <w:r>
+        <w:t>hace</w:t>
+      </w:r>
+      <w:r>
+        <w:t xml:space="preserve"> la inserción de datos</w:t>
+      </w:r>
+      <w:r>
+        <w:t xml:space="preserve"> y se </w:t>
+      </w:r>
+      <w:r>
+        <w:t>soluciona</w:t>
+      </w:r>
+      <w:r>
+        <w:t>n</w:t>
+      </w:r>
+      <w:r>
+        <w:t xml:space="preserve"> algunos fallos en la base de datos</w:t>
+      </w:r>
+      <w:r>
+        <w:t xml:space="preserve"> como algunas vistas que estaban mal planteadas.</w:t>
+      </w:r>
+    </w:p>
+    <w:p>
+      <w:r>
+        <w:t>Aquí hay una muestra de algunos de los datos insertados.</w:t>
       </w:r>
     </w:p>
     <w:p>
@@ -708,7 +1498,7 @@
                     <pic:cNvPicPr/>
                   </pic:nvPicPr>
                   <pic:blipFill>
-                    <a:blip r:embed="rId18"/>
+                    <a:blip r:embed="rId31"/>
                     <a:stretch>
                       <a:fillRect/>
                     </a:stretch>
@@ -731,31 +1521,232 @@
     </w:p>
     <w:p>
       <w:r>
-        <w:t>Muestra de la inserción de datos de la tabla usuarios</w:t>
-      </w:r>
-    </w:p>
-    <w:p>
-      <w:r>
-        <w:t xml:space="preserve">Se mejora el diseño en </w:t>
+        <w:lastRenderedPageBreak/>
+        <w:drawing>
+          <wp:inline distT="0" distB="0" distL="0" distR="0" wp14:anchorId="11AFDD0E" wp14:editId="5B9894F3">
+            <wp:extent cx="5400040" cy="2694940"/>
+            <wp:effectExtent l="0" t="0" r="0" b="0"/>
+            <wp:docPr id="1422442375" name="Imagen 1"/>
+            <wp:cNvGraphicFramePr>
+              <a:graphicFrameLocks xmlns:a="http://schemas.openxmlformats.org/drawingml/2006/main" noChangeAspect="1"/>
+            </wp:cNvGraphicFramePr>
+            <a:graphic xmlns:a="http://schemas.openxmlformats.org/drawingml/2006/main">
+              <a:graphicData uri="http://schemas.openxmlformats.org/drawingml/2006/picture">
+                <pic:pic xmlns:pic="http://schemas.openxmlformats.org/drawingml/2006/picture">
+                  <pic:nvPicPr>
+                    <pic:cNvPr id="1422442375" name=""/>
+                    <pic:cNvPicPr/>
+                  </pic:nvPicPr>
+                  <pic:blipFill>
+                    <a:blip r:embed="rId32"/>
+                    <a:stretch>
+                      <a:fillRect/>
+                    </a:stretch>
+                  </pic:blipFill>
+                  <pic:spPr>
+                    <a:xfrm>
+                      <a:off x="0" y="0"/>
+                      <a:ext cx="5400040" cy="2694940"/>
+                    </a:xfrm>
+                    <a:prstGeom prst="rect">
+                      <a:avLst/>
+                    </a:prstGeom>
+                  </pic:spPr>
+                </pic:pic>
+              </a:graphicData>
+            </a:graphic>
+          </wp:inline>
+        </w:drawing>
+      </w:r>
+    </w:p>
+    <w:p>
+      <w:r>
+        <w:t xml:space="preserve">Como funciona la vista que no se mostró en el día anterior </w:t>
+      </w:r>
+    </w:p>
+    <w:p>
+      <w:r>
+        <w:drawing>
+          <wp:inline distT="0" distB="0" distL="0" distR="0" wp14:anchorId="43D02BB4" wp14:editId="148C053A">
+            <wp:extent cx="5400040" cy="3313430"/>
+            <wp:effectExtent l="0" t="0" r="0" b="1270"/>
+            <wp:docPr id="1769398325" name="Imagen 1"/>
+            <wp:cNvGraphicFramePr>
+              <a:graphicFrameLocks xmlns:a="http://schemas.openxmlformats.org/drawingml/2006/main" noChangeAspect="1"/>
+            </wp:cNvGraphicFramePr>
+            <a:graphic xmlns:a="http://schemas.openxmlformats.org/drawingml/2006/main">
+              <a:graphicData uri="http://schemas.openxmlformats.org/drawingml/2006/picture">
+                <pic:pic xmlns:pic="http://schemas.openxmlformats.org/drawingml/2006/picture">
+                  <pic:nvPicPr>
+                    <pic:cNvPr id="1769398325" name=""/>
+                    <pic:cNvPicPr/>
+                  </pic:nvPicPr>
+                  <pic:blipFill>
+                    <a:blip r:embed="rId33"/>
+                    <a:stretch>
+                      <a:fillRect/>
+                    </a:stretch>
+                  </pic:blipFill>
+                  <pic:spPr>
+                    <a:xfrm>
+                      <a:off x="0" y="0"/>
+                      <a:ext cx="5400040" cy="3313430"/>
+                    </a:xfrm>
+                    <a:prstGeom prst="rect">
+                      <a:avLst/>
+                    </a:prstGeom>
+                  </pic:spPr>
+                </pic:pic>
+              </a:graphicData>
+            </a:graphic>
+          </wp:inline>
+        </w:drawing>
+      </w:r>
+      <w:r>
+        <w:br/>
+      </w:r>
+      <w:r>
+        <w:t>S</w:t>
+      </w:r>
+      <w:r>
+        <w:t>e c</w:t>
+      </w:r>
+      <w:r>
+        <w:t>rea</w:t>
+      </w:r>
+      <w:r>
+        <w:t xml:space="preserve">n </w:t>
+      </w:r>
+      <w:r>
+        <w:t xml:space="preserve">dos métodos en </w:t>
+      </w:r>
+      <w:r>
+        <w:t xml:space="preserve">el </w:t>
+      </w:r>
+      <w:r>
+        <w:t xml:space="preserve">proyecto </w:t>
+      </w:r>
+      <w:r>
+        <w:t xml:space="preserve">en </w:t>
+      </w:r>
+      <w:r>
+        <w:t>java</w:t>
+      </w:r>
+      <w:r>
+        <w:t xml:space="preserve"> </w:t>
+      </w:r>
+      <w:r>
+        <w:t>además del menú</w:t>
+      </w:r>
+    </w:p>
+    <w:p>
+      <w:r>
+        <w:t>Esta es la parte que muestra las opciones y solicita la respuesta del usuario y dependiendo de esa respuesta se ejecuta uno de los siguientes case mostrados en la segunda captura</w:t>
+      </w:r>
+    </w:p>
+    <w:p>
+      <w:r>
+        <w:lastRenderedPageBreak/>
+        <w:drawing>
+          <wp:inline distT="0" distB="0" distL="0" distR="0" wp14:anchorId="73A9A64D" wp14:editId="337C5F94">
+            <wp:extent cx="5400040" cy="2623820"/>
+            <wp:effectExtent l="0" t="0" r="0" b="5080"/>
+            <wp:docPr id="1801373895" name="Imagen 1"/>
+            <wp:cNvGraphicFramePr>
+              <a:graphicFrameLocks xmlns:a="http://schemas.openxmlformats.org/drawingml/2006/main" noChangeAspect="1"/>
+            </wp:cNvGraphicFramePr>
+            <a:graphic xmlns:a="http://schemas.openxmlformats.org/drawingml/2006/main">
+              <a:graphicData uri="http://schemas.openxmlformats.org/drawingml/2006/picture">
+                <pic:pic xmlns:pic="http://schemas.openxmlformats.org/drawingml/2006/picture">
+                  <pic:nvPicPr>
+                    <pic:cNvPr id="1801373895" name=""/>
+                    <pic:cNvPicPr/>
+                  </pic:nvPicPr>
+                  <pic:blipFill>
+                    <a:blip r:embed="rId34"/>
+                    <a:stretch>
+                      <a:fillRect/>
+                    </a:stretch>
+                  </pic:blipFill>
+                  <pic:spPr>
+                    <a:xfrm>
+                      <a:off x="0" y="0"/>
+                      <a:ext cx="5400040" cy="2623820"/>
+                    </a:xfrm>
+                    <a:prstGeom prst="rect">
+                      <a:avLst/>
+                    </a:prstGeom>
+                  </pic:spPr>
+                </pic:pic>
+              </a:graphicData>
+            </a:graphic>
+          </wp:inline>
+        </w:drawing>
+      </w:r>
+    </w:p>
+    <w:p>
+      <w:r>
+        <w:drawing>
+          <wp:inline distT="0" distB="0" distL="0" distR="0" wp14:anchorId="572F4F56" wp14:editId="5FFCC9B0">
+            <wp:extent cx="5400040" cy="3589655"/>
+            <wp:effectExtent l="0" t="0" r="0" b="0"/>
+            <wp:docPr id="2080798821" name="Imagen 1"/>
+            <wp:cNvGraphicFramePr>
+              <a:graphicFrameLocks xmlns:a="http://schemas.openxmlformats.org/drawingml/2006/main" noChangeAspect="1"/>
+            </wp:cNvGraphicFramePr>
+            <a:graphic xmlns:a="http://schemas.openxmlformats.org/drawingml/2006/main">
+              <a:graphicData uri="http://schemas.openxmlformats.org/drawingml/2006/picture">
+                <pic:pic xmlns:pic="http://schemas.openxmlformats.org/drawingml/2006/picture">
+                  <pic:nvPicPr>
+                    <pic:cNvPr id="2080798821" name=""/>
+                    <pic:cNvPicPr/>
+                  </pic:nvPicPr>
+                  <pic:blipFill>
+                    <a:blip r:embed="rId35"/>
+                    <a:stretch>
+                      <a:fillRect/>
+                    </a:stretch>
+                  </pic:blipFill>
+                  <pic:spPr>
+                    <a:xfrm>
+                      <a:off x="0" y="0"/>
+                      <a:ext cx="5400040" cy="3589655"/>
+                    </a:xfrm>
+                    <a:prstGeom prst="rect">
+                      <a:avLst/>
+                    </a:prstGeom>
+                  </pic:spPr>
+                </pic:pic>
+              </a:graphicData>
+            </a:graphic>
+          </wp:inline>
+        </w:drawing>
+      </w:r>
+    </w:p>
+    <w:p>
+      <w:r>
+        <w:t xml:space="preserve"> </w:t>
+      </w:r>
+    </w:p>
+    <w:p>
+      <w:r>
+        <w:t xml:space="preserve">El método </w:t>
       </w:r>
       <w:proofErr w:type="spellStart"/>
       <w:r>
-        <w:t>figma</w:t>
+        <w:t>añadir_usuario</w:t>
       </w:r>
       <w:proofErr w:type="spellEnd"/>
       <w:r>
-        <w:br/>
-      </w:r>
-      <w:r>
-        <w:t>creación de dos métodos en proyecto java</w:t>
-      </w:r>
-    </w:p>
-    <w:p>
-      <w:r>
+        <w:t xml:space="preserve"> lo que solicita al usuario que introduzca nombre, correo y contraseña y verifica si el correo ya existe si el correo ya existe no deja crear y muestra un mensaje si el correo no existe crea el usuario y muestra otro mensaje.</w:t>
+      </w:r>
+    </w:p>
+    <w:p/>
+    <w:p>
+      <w:r>
+        <w:lastRenderedPageBreak/>
         <w:t>Muestra del método para añadir usuario</w:t>
       </w:r>
-    </w:p>
-    <w:p>
       <w:r>
         <w:rPr>
           <w:noProof/>
@@ -776,7 +1767,7 @@
                     <pic:cNvPicPr/>
                   </pic:nvPicPr>
                   <pic:blipFill>
-                    <a:blip r:embed="rId19"/>
+                    <a:blip r:embed="rId36"/>
                     <a:stretch>
                       <a:fillRect/>
                     </a:stretch>
@@ -797,27 +1788,628 @@
         </w:drawing>
       </w:r>
     </w:p>
+    <w:p>
+      <w:r>
+        <w:t xml:space="preserve">El método </w:t>
+      </w:r>
+      <w:proofErr w:type="spellStart"/>
+      <w:r>
+        <w:t>eliminar_usuario</w:t>
+      </w:r>
+      <w:proofErr w:type="spellEnd"/>
+      <w:r>
+        <w:t xml:space="preserve"> </w:t>
+      </w:r>
+      <w:r>
+        <w:t>solicita el correo del usuario a eliminar y verifica si existe si existe lo elimina y muestra un mensaje si no muestra otro mensaje.</w:t>
+      </w:r>
+    </w:p>
+    <w:p>
+      <w:r>
+        <w:t>Muestra del método para eliminarlo</w:t>
+      </w:r>
+    </w:p>
+    <w:p>
+      <w:r>
+        <w:drawing>
+          <wp:inline distT="0" distB="0" distL="0" distR="0" wp14:anchorId="18968379" wp14:editId="603C69A2">
+            <wp:extent cx="5400040" cy="1927225"/>
+            <wp:effectExtent l="0" t="0" r="0" b="0"/>
+            <wp:docPr id="1313433223" name="Imagen 1"/>
+            <wp:cNvGraphicFramePr>
+              <a:graphicFrameLocks xmlns:a="http://schemas.openxmlformats.org/drawingml/2006/main" noChangeAspect="1"/>
+            </wp:cNvGraphicFramePr>
+            <a:graphic xmlns:a="http://schemas.openxmlformats.org/drawingml/2006/main">
+              <a:graphicData uri="http://schemas.openxmlformats.org/drawingml/2006/picture">
+                <pic:pic xmlns:pic="http://schemas.openxmlformats.org/drawingml/2006/picture">
+                  <pic:nvPicPr>
+                    <pic:cNvPr id="1313433223" name=""/>
+                    <pic:cNvPicPr/>
+                  </pic:nvPicPr>
+                  <pic:blipFill>
+                    <a:blip r:embed="rId37"/>
+                    <a:stretch>
+                      <a:fillRect/>
+                    </a:stretch>
+                  </pic:blipFill>
+                  <pic:spPr>
+                    <a:xfrm>
+                      <a:off x="0" y="0"/>
+                      <a:ext cx="5400040" cy="1927225"/>
+                    </a:xfrm>
+                    <a:prstGeom prst="rect">
+                      <a:avLst/>
+                    </a:prstGeom>
+                  </pic:spPr>
+                </pic:pic>
+              </a:graphicData>
+            </a:graphic>
+          </wp:inline>
+        </w:drawing>
+      </w:r>
+    </w:p>
     <w:p/>
     <w:p>
       <w:r>
+        <w:t>Dia 27-3:</w:t>
+      </w:r>
+    </w:p>
+    <w:p>
+      <w:r>
+        <w:t>Se continua con el proyecto en java</w:t>
+      </w:r>
+      <w:r>
+        <w:t xml:space="preserve"> creando métodos</w:t>
+      </w:r>
+      <w:r>
+        <w:t xml:space="preserve"> y se arreglan </w:t>
+      </w:r>
+      <w:r>
+        <w:t xml:space="preserve">los </w:t>
+      </w:r>
+      <w:r>
+        <w:t>errores</w:t>
+      </w:r>
+      <w:r>
+        <w:t xml:space="preserve"> que surgen de estos</w:t>
+      </w:r>
+    </w:p>
+    <w:p>
+      <w:r>
+        <w:t>Se crea el método para comprobar que la respuesta sea un número entre el 1 y el 9 y si no lo esta muestra un mensaje.</w:t>
+      </w:r>
+    </w:p>
+    <w:p>
+      <w:r>
+        <w:drawing>
+          <wp:inline distT="0" distB="0" distL="0" distR="0" wp14:anchorId="6309A825" wp14:editId="5467025A">
+            <wp:extent cx="5400040" cy="682625"/>
+            <wp:effectExtent l="0" t="0" r="0" b="3175"/>
+            <wp:docPr id="421273922" name="Imagen 1"/>
+            <wp:cNvGraphicFramePr>
+              <a:graphicFrameLocks xmlns:a="http://schemas.openxmlformats.org/drawingml/2006/main" noChangeAspect="1"/>
+            </wp:cNvGraphicFramePr>
+            <a:graphic xmlns:a="http://schemas.openxmlformats.org/drawingml/2006/main">
+              <a:graphicData uri="http://schemas.openxmlformats.org/drawingml/2006/picture">
+                <pic:pic xmlns:pic="http://schemas.openxmlformats.org/drawingml/2006/picture">
+                  <pic:nvPicPr>
+                    <pic:cNvPr id="421273922" name=""/>
+                    <pic:cNvPicPr/>
+                  </pic:nvPicPr>
+                  <pic:blipFill>
+                    <a:blip r:embed="rId38"/>
+                    <a:stretch>
+                      <a:fillRect/>
+                    </a:stretch>
+                  </pic:blipFill>
+                  <pic:spPr>
+                    <a:xfrm>
+                      <a:off x="0" y="0"/>
+                      <a:ext cx="5400040" cy="682625"/>
+                    </a:xfrm>
+                    <a:prstGeom prst="rect">
+                      <a:avLst/>
+                    </a:prstGeom>
+                  </pic:spPr>
+                </pic:pic>
+              </a:graphicData>
+            </a:graphic>
+          </wp:inline>
+        </w:drawing>
+      </w:r>
+    </w:p>
+    <w:p>
+      <w:r>
         <w:lastRenderedPageBreak/>
-        <w:t>Dia 27-3:</w:t>
-      </w:r>
-    </w:p>
-    <w:p>
-      <w:r>
-        <w:t>Se continua con el proyecto en java y se arreglan errores</w:t>
+        <w:t>El método para añadir evento solicita la información al usuario del evento le asigna un id y muestra un mensaje</w:t>
+      </w:r>
+    </w:p>
+    <w:p>
+      <w:r>
+        <w:drawing>
+          <wp:inline distT="0" distB="0" distL="0" distR="0" wp14:anchorId="5ED63BDB" wp14:editId="180FD701">
+            <wp:extent cx="5400040" cy="2178050"/>
+            <wp:effectExtent l="0" t="0" r="0" b="0"/>
+            <wp:docPr id="440290523" name="Imagen 1"/>
+            <wp:cNvGraphicFramePr>
+              <a:graphicFrameLocks xmlns:a="http://schemas.openxmlformats.org/drawingml/2006/main" noChangeAspect="1"/>
+            </wp:cNvGraphicFramePr>
+            <a:graphic xmlns:a="http://schemas.openxmlformats.org/drawingml/2006/main">
+              <a:graphicData uri="http://schemas.openxmlformats.org/drawingml/2006/picture">
+                <pic:pic xmlns:pic="http://schemas.openxmlformats.org/drawingml/2006/picture">
+                  <pic:nvPicPr>
+                    <pic:cNvPr id="440290523" name=""/>
+                    <pic:cNvPicPr/>
+                  </pic:nvPicPr>
+                  <pic:blipFill>
+                    <a:blip r:embed="rId39"/>
+                    <a:stretch>
+                      <a:fillRect/>
+                    </a:stretch>
+                  </pic:blipFill>
+                  <pic:spPr>
+                    <a:xfrm>
+                      <a:off x="0" y="0"/>
+                      <a:ext cx="5400040" cy="2178050"/>
+                    </a:xfrm>
+                    <a:prstGeom prst="rect">
+                      <a:avLst/>
+                    </a:prstGeom>
+                  </pic:spPr>
+                </pic:pic>
+              </a:graphicData>
+            </a:graphic>
+          </wp:inline>
+        </w:drawing>
+      </w:r>
+    </w:p>
+    <w:p>
+      <w:r>
+        <w:t xml:space="preserve">El </w:t>
+      </w:r>
+      <w:r>
+        <w:t>método</w:t>
+      </w:r>
+      <w:r>
+        <w:t xml:space="preserve"> de eliminar evento muestra los eventos ya creados y su respectivo id y solicita al usuario introducir el id del evento a borrar</w:t>
+      </w:r>
+    </w:p>
+    <w:p>
+      <w:r>
+        <w:drawing>
+          <wp:inline distT="0" distB="0" distL="0" distR="0" wp14:anchorId="468E8095" wp14:editId="53266B70">
+            <wp:extent cx="5400040" cy="2740025"/>
+            <wp:effectExtent l="0" t="0" r="0" b="3175"/>
+            <wp:docPr id="1878934543" name="Imagen 1"/>
+            <wp:cNvGraphicFramePr>
+              <a:graphicFrameLocks xmlns:a="http://schemas.openxmlformats.org/drawingml/2006/main" noChangeAspect="1"/>
+            </wp:cNvGraphicFramePr>
+            <a:graphic xmlns:a="http://schemas.openxmlformats.org/drawingml/2006/main">
+              <a:graphicData uri="http://schemas.openxmlformats.org/drawingml/2006/picture">
+                <pic:pic xmlns:pic="http://schemas.openxmlformats.org/drawingml/2006/picture">
+                  <pic:nvPicPr>
+                    <pic:cNvPr id="1878934543" name=""/>
+                    <pic:cNvPicPr/>
+                  </pic:nvPicPr>
+                  <pic:blipFill>
+                    <a:blip r:embed="rId40"/>
+                    <a:stretch>
+                      <a:fillRect/>
+                    </a:stretch>
+                  </pic:blipFill>
+                  <pic:spPr>
+                    <a:xfrm>
+                      <a:off x="0" y="0"/>
+                      <a:ext cx="5400040" cy="2740025"/>
+                    </a:xfrm>
+                    <a:prstGeom prst="rect">
+                      <a:avLst/>
+                    </a:prstGeom>
+                  </pic:spPr>
+                </pic:pic>
+              </a:graphicData>
+            </a:graphic>
+          </wp:inline>
+        </w:drawing>
+      </w:r>
+    </w:p>
+    <w:p>
+      <w:r>
+        <w:t>El método añadir galería muestra todos los eventos creados y sus id, solicita al usuario por teclado primero el id del evento en el que se desea introducir la galería y luego los datos de la galería para crearla</w:t>
       </w:r>
     </w:p>
     <w:p/>
     <w:p>
       <w:r>
+        <w:lastRenderedPageBreak/>
+        <w:drawing>
+          <wp:inline distT="0" distB="0" distL="0" distR="0" wp14:anchorId="47113540" wp14:editId="0729A630">
+            <wp:extent cx="5083517" cy="1716225"/>
+            <wp:effectExtent l="0" t="0" r="3175" b="0"/>
+            <wp:docPr id="1142158266" name="Imagen 1"/>
+            <wp:cNvGraphicFramePr>
+              <a:graphicFrameLocks xmlns:a="http://schemas.openxmlformats.org/drawingml/2006/main" noChangeAspect="1"/>
+            </wp:cNvGraphicFramePr>
+            <a:graphic xmlns:a="http://schemas.openxmlformats.org/drawingml/2006/main">
+              <a:graphicData uri="http://schemas.openxmlformats.org/drawingml/2006/picture">
+                <pic:pic xmlns:pic="http://schemas.openxmlformats.org/drawingml/2006/picture">
+                  <pic:nvPicPr>
+                    <pic:cNvPr id="1142158266" name=""/>
+                    <pic:cNvPicPr/>
+                  </pic:nvPicPr>
+                  <pic:blipFill>
+                    <a:blip r:embed="rId41"/>
+                    <a:stretch>
+                      <a:fillRect/>
+                    </a:stretch>
+                  </pic:blipFill>
+                  <pic:spPr>
+                    <a:xfrm>
+                      <a:off x="0" y="0"/>
+                      <a:ext cx="5086388" cy="1717194"/>
+                    </a:xfrm>
+                    <a:prstGeom prst="rect">
+                      <a:avLst/>
+                    </a:prstGeom>
+                  </pic:spPr>
+                </pic:pic>
+              </a:graphicData>
+            </a:graphic>
+          </wp:inline>
+        </w:drawing>
+      </w:r>
+    </w:p>
+    <w:p>
+      <w:r>
+        <w:drawing>
+          <wp:inline distT="0" distB="0" distL="0" distR="0" wp14:anchorId="0BD0D9F8" wp14:editId="390F0668">
+            <wp:extent cx="5400040" cy="2171700"/>
+            <wp:effectExtent l="0" t="0" r="0" b="0"/>
+            <wp:docPr id="1560186398" name="Imagen 1"/>
+            <wp:cNvGraphicFramePr>
+              <a:graphicFrameLocks xmlns:a="http://schemas.openxmlformats.org/drawingml/2006/main" noChangeAspect="1"/>
+            </wp:cNvGraphicFramePr>
+            <a:graphic xmlns:a="http://schemas.openxmlformats.org/drawingml/2006/main">
+              <a:graphicData uri="http://schemas.openxmlformats.org/drawingml/2006/picture">
+                <pic:pic xmlns:pic="http://schemas.openxmlformats.org/drawingml/2006/picture">
+                  <pic:nvPicPr>
+                    <pic:cNvPr id="1560186398" name=""/>
+                    <pic:cNvPicPr/>
+                  </pic:nvPicPr>
+                  <pic:blipFill>
+                    <a:blip r:embed="rId42"/>
+                    <a:stretch>
+                      <a:fillRect/>
+                    </a:stretch>
+                  </pic:blipFill>
+                  <pic:spPr>
+                    <a:xfrm>
+                      <a:off x="0" y="0"/>
+                      <a:ext cx="5400040" cy="2171700"/>
+                    </a:xfrm>
+                    <a:prstGeom prst="rect">
+                      <a:avLst/>
+                    </a:prstGeom>
+                  </pic:spPr>
+                </pic:pic>
+              </a:graphicData>
+            </a:graphic>
+          </wp:inline>
+        </w:drawing>
+      </w:r>
+    </w:p>
+    <w:p/>
+    <w:p>
+      <w:r>
         <w:t>Dia 6-4:</w:t>
       </w:r>
     </w:p>
     <w:p>
       <w:r>
-        <w:t>Se arreglan algunos errores y se terminar el proyecto en java.</w:t>
+        <w:t xml:space="preserve">Se arreglan algunos errores </w:t>
+      </w:r>
+      <w:r>
+        <w:t>que surgen mientras se crean los últimos métodos para</w:t>
+      </w:r>
+      <w:r>
+        <w:t xml:space="preserve"> terminar el proyecto en java.</w:t>
+      </w:r>
+    </w:p>
+    <w:p>
+      <w:r>
+        <w:t xml:space="preserve">Método eliminar galería muestra los eventos creados y sus id solicita que se seleccione un id del evento que contenga la galería a eliminar, muestra los id de </w:t>
+      </w:r>
+      <w:proofErr w:type="gramStart"/>
+      <w:r>
+        <w:t>las galería</w:t>
+      </w:r>
+      <w:proofErr w:type="gramEnd"/>
+      <w:r>
+        <w:t xml:space="preserve"> y las galerías creadas y te pide el id de la galería a eliminar al seleccionar el id se elimina la seleccionada</w:t>
+      </w:r>
+    </w:p>
+    <w:p>
+      <w:r>
+        <w:t>Muestra del método</w:t>
+      </w:r>
+    </w:p>
+    <w:p>
+      <w:r>
+        <w:lastRenderedPageBreak/>
+        <w:drawing>
+          <wp:inline distT="0" distB="0" distL="0" distR="0" wp14:anchorId="22C95845" wp14:editId="0CDDA14A">
+            <wp:extent cx="5400040" cy="2579370"/>
+            <wp:effectExtent l="0" t="0" r="0" b="0"/>
+            <wp:docPr id="662394535" name="Imagen 1"/>
+            <wp:cNvGraphicFramePr>
+              <a:graphicFrameLocks xmlns:a="http://schemas.openxmlformats.org/drawingml/2006/main" noChangeAspect="1"/>
+            </wp:cNvGraphicFramePr>
+            <a:graphic xmlns:a="http://schemas.openxmlformats.org/drawingml/2006/main">
+              <a:graphicData uri="http://schemas.openxmlformats.org/drawingml/2006/picture">
+                <pic:pic xmlns:pic="http://schemas.openxmlformats.org/drawingml/2006/picture">
+                  <pic:nvPicPr>
+                    <pic:cNvPr id="662394535" name=""/>
+                    <pic:cNvPicPr/>
+                  </pic:nvPicPr>
+                  <pic:blipFill>
+                    <a:blip r:embed="rId43"/>
+                    <a:stretch>
+                      <a:fillRect/>
+                    </a:stretch>
+                  </pic:blipFill>
+                  <pic:spPr>
+                    <a:xfrm>
+                      <a:off x="0" y="0"/>
+                      <a:ext cx="5400040" cy="2579370"/>
+                    </a:xfrm>
+                    <a:prstGeom prst="rect">
+                      <a:avLst/>
+                    </a:prstGeom>
+                  </pic:spPr>
+                </pic:pic>
+              </a:graphicData>
+            </a:graphic>
+          </wp:inline>
+        </w:drawing>
+      </w:r>
+    </w:p>
+    <w:p>
+      <w:r>
+        <w:drawing>
+          <wp:inline distT="0" distB="0" distL="0" distR="0" wp14:anchorId="41A3A13E" wp14:editId="22D68ECF">
+            <wp:extent cx="5400040" cy="3093085"/>
+            <wp:effectExtent l="0" t="0" r="0" b="0"/>
+            <wp:docPr id="797115613" name="Imagen 1"/>
+            <wp:cNvGraphicFramePr>
+              <a:graphicFrameLocks xmlns:a="http://schemas.openxmlformats.org/drawingml/2006/main" noChangeAspect="1"/>
+            </wp:cNvGraphicFramePr>
+            <a:graphic xmlns:a="http://schemas.openxmlformats.org/drawingml/2006/main">
+              <a:graphicData uri="http://schemas.openxmlformats.org/drawingml/2006/picture">
+                <pic:pic xmlns:pic="http://schemas.openxmlformats.org/drawingml/2006/picture">
+                  <pic:nvPicPr>
+                    <pic:cNvPr id="797115613" name=""/>
+                    <pic:cNvPicPr/>
+                  </pic:nvPicPr>
+                  <pic:blipFill>
+                    <a:blip r:embed="rId44"/>
+                    <a:stretch>
+                      <a:fillRect/>
+                    </a:stretch>
+                  </pic:blipFill>
+                  <pic:spPr>
+                    <a:xfrm>
+                      <a:off x="0" y="0"/>
+                      <a:ext cx="5400040" cy="3093085"/>
+                    </a:xfrm>
+                    <a:prstGeom prst="rect">
+                      <a:avLst/>
+                    </a:prstGeom>
+                  </pic:spPr>
+                </pic:pic>
+              </a:graphicData>
+            </a:graphic>
+          </wp:inline>
+        </w:drawing>
+      </w:r>
+    </w:p>
+    <w:p/>
+    <w:p/>
+    <w:p/>
+    <w:p/>
+    <w:p/>
+    <w:p/>
+    <w:p/>
+    <w:p/>
+    <w:p/>
+    <w:p>
+      <w:r>
+        <w:lastRenderedPageBreak/>
+        <w:t>Método de añadir favorito</w:t>
+      </w:r>
+      <w:r>
+        <w:t xml:space="preserve">, muestra todos los eventos </w:t>
+      </w:r>
+      <w:r>
+        <w:t>con sus id</w:t>
+      </w:r>
+      <w:r>
+        <w:t xml:space="preserve"> y usuarios creados solicita que se introduzca el id de evento que se desea poner de favorito y el correo del usuario que quiere el evento de favorito si los datos introducidos corresponden a eventos y usuarios existentes se crea y salta un mensaje de creado correctamente si no un mensaje de que no existe</w:t>
+      </w:r>
+    </w:p>
+    <w:p>
+      <w:r>
+        <w:t>Muestra del código:</w:t>
+      </w:r>
+    </w:p>
+    <w:p>
+      <w:r>
+        <w:drawing>
+          <wp:inline distT="0" distB="0" distL="0" distR="0" wp14:anchorId="64F64A9C" wp14:editId="447DEE28">
+            <wp:extent cx="5400040" cy="3045460"/>
+            <wp:effectExtent l="0" t="0" r="0" b="2540"/>
+            <wp:docPr id="160359787" name="Imagen 1"/>
+            <wp:cNvGraphicFramePr>
+              <a:graphicFrameLocks xmlns:a="http://schemas.openxmlformats.org/drawingml/2006/main" noChangeAspect="1"/>
+            </wp:cNvGraphicFramePr>
+            <a:graphic xmlns:a="http://schemas.openxmlformats.org/drawingml/2006/main">
+              <a:graphicData uri="http://schemas.openxmlformats.org/drawingml/2006/picture">
+                <pic:pic xmlns:pic="http://schemas.openxmlformats.org/drawingml/2006/picture">
+                  <pic:nvPicPr>
+                    <pic:cNvPr id="160359787" name=""/>
+                    <pic:cNvPicPr/>
+                  </pic:nvPicPr>
+                  <pic:blipFill>
+                    <a:blip r:embed="rId45"/>
+                    <a:stretch>
+                      <a:fillRect/>
+                    </a:stretch>
+                  </pic:blipFill>
+                  <pic:spPr>
+                    <a:xfrm>
+                      <a:off x="0" y="0"/>
+                      <a:ext cx="5400040" cy="3045460"/>
+                    </a:xfrm>
+                    <a:prstGeom prst="rect">
+                      <a:avLst/>
+                    </a:prstGeom>
+                  </pic:spPr>
+                </pic:pic>
+              </a:graphicData>
+            </a:graphic>
+          </wp:inline>
+        </w:drawing>
+      </w:r>
+    </w:p>
+    <w:p>
+      <w:r>
+        <w:drawing>
+          <wp:inline distT="0" distB="0" distL="0" distR="0" wp14:anchorId="22B98074" wp14:editId="6E4E9941">
+            <wp:extent cx="5400040" cy="2480310"/>
+            <wp:effectExtent l="0" t="0" r="0" b="0"/>
+            <wp:docPr id="1606245124" name="Imagen 1"/>
+            <wp:cNvGraphicFramePr>
+              <a:graphicFrameLocks xmlns:a="http://schemas.openxmlformats.org/drawingml/2006/main" noChangeAspect="1"/>
+            </wp:cNvGraphicFramePr>
+            <a:graphic xmlns:a="http://schemas.openxmlformats.org/drawingml/2006/main">
+              <a:graphicData uri="http://schemas.openxmlformats.org/drawingml/2006/picture">
+                <pic:pic xmlns:pic="http://schemas.openxmlformats.org/drawingml/2006/picture">
+                  <pic:nvPicPr>
+                    <pic:cNvPr id="1606245124" name=""/>
+                    <pic:cNvPicPr/>
+                  </pic:nvPicPr>
+                  <pic:blipFill>
+                    <a:blip r:embed="rId46"/>
+                    <a:stretch>
+                      <a:fillRect/>
+                    </a:stretch>
+                  </pic:blipFill>
+                  <pic:spPr>
+                    <a:xfrm>
+                      <a:off x="0" y="0"/>
+                      <a:ext cx="5400040" cy="2480310"/>
+                    </a:xfrm>
+                    <a:prstGeom prst="rect">
+                      <a:avLst/>
+                    </a:prstGeom>
+                  </pic:spPr>
+                </pic:pic>
+              </a:graphicData>
+            </a:graphic>
+          </wp:inline>
+        </w:drawing>
+      </w:r>
+    </w:p>
+    <w:p/>
+    <w:p/>
+    <w:p/>
+    <w:p/>
+    <w:p>
+      <w:r>
+        <w:lastRenderedPageBreak/>
+        <w:t>Método de eliminar favorito, muestra los eventos favoritos creados con el id de evento y el correo del usuario solicita el correo y el id de evento si los datos introducidos corresponden a un usuario y un evento existentes mensaje de borrado correctamente si no mensaje de que no existe</w:t>
+      </w:r>
+    </w:p>
+    <w:p>
+      <w:r>
+        <w:t>Muestra del código:</w:t>
+      </w:r>
+    </w:p>
+    <w:p>
+      <w:r>
+        <w:drawing>
+          <wp:inline distT="0" distB="0" distL="0" distR="0" wp14:anchorId="50F8FEC8" wp14:editId="79866F5B">
+            <wp:extent cx="5400040" cy="2256155"/>
+            <wp:effectExtent l="0" t="0" r="0" b="0"/>
+            <wp:docPr id="1421947238" name="Imagen 1"/>
+            <wp:cNvGraphicFramePr>
+              <a:graphicFrameLocks xmlns:a="http://schemas.openxmlformats.org/drawingml/2006/main" noChangeAspect="1"/>
+            </wp:cNvGraphicFramePr>
+            <a:graphic xmlns:a="http://schemas.openxmlformats.org/drawingml/2006/main">
+              <a:graphicData uri="http://schemas.openxmlformats.org/drawingml/2006/picture">
+                <pic:pic xmlns:pic="http://schemas.openxmlformats.org/drawingml/2006/picture">
+                  <pic:nvPicPr>
+                    <pic:cNvPr id="1421947238" name=""/>
+                    <pic:cNvPicPr/>
+                  </pic:nvPicPr>
+                  <pic:blipFill>
+                    <a:blip r:embed="rId47"/>
+                    <a:stretch>
+                      <a:fillRect/>
+                    </a:stretch>
+                  </pic:blipFill>
+                  <pic:spPr>
+                    <a:xfrm>
+                      <a:off x="0" y="0"/>
+                      <a:ext cx="5400040" cy="2256155"/>
+                    </a:xfrm>
+                    <a:prstGeom prst="rect">
+                      <a:avLst/>
+                    </a:prstGeom>
+                  </pic:spPr>
+                </pic:pic>
+              </a:graphicData>
+            </a:graphic>
+          </wp:inline>
+        </w:drawing>
+      </w:r>
+    </w:p>
+    <w:p>
+      <w:r>
+        <w:drawing>
+          <wp:inline distT="0" distB="0" distL="0" distR="0" wp14:anchorId="770C651D" wp14:editId="4A60C4D5">
+            <wp:extent cx="5400040" cy="3390265"/>
+            <wp:effectExtent l="0" t="0" r="0" b="635"/>
+            <wp:docPr id="773138255" name="Imagen 1"/>
+            <wp:cNvGraphicFramePr>
+              <a:graphicFrameLocks xmlns:a="http://schemas.openxmlformats.org/drawingml/2006/main" noChangeAspect="1"/>
+            </wp:cNvGraphicFramePr>
+            <a:graphic xmlns:a="http://schemas.openxmlformats.org/drawingml/2006/main">
+              <a:graphicData uri="http://schemas.openxmlformats.org/drawingml/2006/picture">
+                <pic:pic xmlns:pic="http://schemas.openxmlformats.org/drawingml/2006/picture">
+                  <pic:nvPicPr>
+                    <pic:cNvPr id="773138255" name=""/>
+                    <pic:cNvPicPr/>
+                  </pic:nvPicPr>
+                  <pic:blipFill>
+                    <a:blip r:embed="rId48"/>
+                    <a:stretch>
+                      <a:fillRect/>
+                    </a:stretch>
+                  </pic:blipFill>
+                  <pic:spPr>
+                    <a:xfrm>
+                      <a:off x="0" y="0"/>
+                      <a:ext cx="5400040" cy="3390265"/>
+                    </a:xfrm>
+                    <a:prstGeom prst="rect">
+                      <a:avLst/>
+                    </a:prstGeom>
+                  </pic:spPr>
+                </pic:pic>
+              </a:graphicData>
+            </a:graphic>
+          </wp:inline>
+        </w:drawing>
       </w:r>
     </w:p>
     <w:p>
@@ -858,7 +2450,15 @@
       </w:r>
       <w:proofErr w:type="spellEnd"/>
       <w:r>
-        <w:t xml:space="preserve"> + crear el resto de secciones de la </w:t>
+        <w:t xml:space="preserve"> + crear el resto de </w:t>
+      </w:r>
+      <w:proofErr w:type="gramStart"/>
+      <w:r>
+        <w:t>secciones</w:t>
+      </w:r>
+      <w:proofErr w:type="gramEnd"/>
+      <w:r>
+        <w:t xml:space="preserve"> de la </w:t>
       </w:r>
       <w:proofErr w:type="spellStart"/>
       <w:r>
@@ -876,6 +2476,7 @@
     </w:p>
     <w:p>
       <w:r>
+        <w:lastRenderedPageBreak/>
         <w:t xml:space="preserve">Cambiar todos los eventos del historial por que la estructura esta mal hecha y no permite meter las </w:t>
       </w:r>
       <w:r>
@@ -923,11 +2524,22 @@
       </w:r>
       <w:proofErr w:type="spellEnd"/>
       <w:r>
-        <w:t xml:space="preserve"> mediante un link.</w:t>
-      </w:r>
-    </w:p>
-    <w:p>
-      <w:r>
+        <w:t xml:space="preserve"> mediante un </w:t>
+      </w:r>
+      <w:proofErr w:type="gramStart"/>
+      <w:r>
+        <w:t>link</w:t>
+      </w:r>
+      <w:proofErr w:type="gramEnd"/>
+      <w:r>
+        <w:t>.</w:t>
+      </w:r>
+    </w:p>
+    <w:p>
+      <w:r>
+        <w:rPr>
+          <w:noProof/>
+        </w:rPr>
         <w:drawing>
           <wp:inline distT="0" distB="0" distL="0" distR="0" wp14:anchorId="4A22607C" wp14:editId="194B9CDA">
             <wp:extent cx="5400040" cy="113030"/>
@@ -944,7 +2556,7 @@
                     <pic:cNvPicPr/>
                   </pic:nvPicPr>
                   <pic:blipFill>
-                    <a:blip r:embed="rId20"/>
+                    <a:blip r:embed="rId49"/>
                     <a:stretch>
                       <a:fillRect/>
                     </a:stretch>
@@ -1740,6 +3352,7 @@
   <w:style w:type="paragraph" w:default="1" w:styleId="Normal">
     <w:name w:val="Normal"/>
     <w:qFormat/>
+    <w:rsid w:val="00EA5E19"/>
   </w:style>
   <w:style w:type="paragraph" w:styleId="Ttulo1">
     <w:name w:val="heading 1"/>

</xml_diff>